<commit_message>
Fix: solucionado error que solo permitia crear tipos de incidencia intercalados y primera version del plan de pruebas.
Para ello se ha añadido una entrada inicial al spinner y la posicion de este se resetea a 0 tras cada pulsacion, asi se activa siempre el metodo correspondiente al pulsar cualquier tipo independientemente del orden.
</commit_message>
<xml_diff>
--- a/Docs/Test Plans/US532239-CrearIncidenciaEnUnaEstacion-TestPlan.docx
+++ b/Docs/Test Plans/US532239-CrearIncidenciaEnUnaEstacion-TestPlan.docx
@@ -80,7 +80,19 @@
         <w:rPr>
           <w:lang w:val="es-ES_tradnl"/>
         </w:rPr>
-        <w:t>Estacion</w:t>
+        <w:t>Estaci</w:t>
+      </w:r>
+      <w:r>
+        <w:rPr>
+          <w:lang w:val="es-ES_tradnl"/>
+        </w:rPr>
+        <w:t>ó</w:t>
+      </w:r>
+      <w:r>
+        <w:rPr>
+          <w:lang w:val="es-ES_tradnl"/>
+        </w:rPr>
+        <w:t>n</w:t>
       </w:r>
       <w:r>
         <w:rPr>
@@ -147,8 +159,21 @@
       </w:r>
     </w:p>
     <w:p>
-      <w:r>
-        <w:t>Prueba 00. Éxito:</w:t>
+      <w:pPr>
+        <w:autoSpaceDE w:val="0"/>
+        <w:autoSpaceDN w:val="0"/>
+        <w:adjustRightInd w:val="0"/>
+        <w:spacing w:after="120" w:line="240" w:lineRule="auto"/>
+        <w:jc w:val="both"/>
+        <w:rPr>
+          <w:rFonts w:eastAsiaTheme="minorHAnsi" w:cs="Calibri"/>
+        </w:rPr>
+      </w:pPr>
+      <w:r>
+        <w:rPr>
+          <w:rFonts w:eastAsiaTheme="minorHAnsi" w:cs="Calibri"/>
+        </w:rPr>
+        <w:t>Prueba 00. Éxito (Incidencia predefinida):</w:t>
       </w:r>
     </w:p>
     <w:p>
@@ -156,19 +181,22 @@
         <w:pStyle w:val="Prrafodelista"/>
         <w:numPr>
           <w:ilvl w:val="0"/>
-          <w:numId w:val="2"/>
+          <w:numId w:val="17"/>
         </w:numPr>
-        <w:tabs>
-          <w:tab w:val="clear" w:pos="720"/>
-        </w:tabs>
         <w:autoSpaceDE w:val="0"/>
         <w:autoSpaceDN w:val="0"/>
         <w:adjustRightInd w:val="0"/>
-        <w:spacing w:after="0" w:line="240" w:lineRule="auto"/>
-        <w:ind w:left="1068"/>
-      </w:pPr>
-      <w:r>
-        <w:t>El técnico selecciona una red de la lista de redes principal.</w:t>
+        <w:spacing w:after="120" w:line="240" w:lineRule="auto"/>
+        <w:jc w:val="both"/>
+        <w:rPr>
+          <w:rFonts w:eastAsiaTheme="minorHAnsi" w:cs="Calibri"/>
+        </w:rPr>
+      </w:pPr>
+      <w:r>
+        <w:rPr>
+          <w:rFonts w:eastAsiaTheme="minorHAnsi" w:cs="Calibri"/>
+        </w:rPr>
+        <w:t>El técnico selecciona crear una nueva incidencia de la estación.</w:t>
       </w:r>
     </w:p>
     <w:p>
@@ -176,19 +204,22 @@
         <w:pStyle w:val="Prrafodelista"/>
         <w:numPr>
           <w:ilvl w:val="0"/>
-          <w:numId w:val="2"/>
+          <w:numId w:val="17"/>
         </w:numPr>
-        <w:tabs>
-          <w:tab w:val="clear" w:pos="720"/>
-        </w:tabs>
         <w:autoSpaceDE w:val="0"/>
         <w:autoSpaceDN w:val="0"/>
         <w:adjustRightInd w:val="0"/>
-        <w:spacing w:after="0" w:line="240" w:lineRule="auto"/>
-        <w:ind w:left="1068"/>
-      </w:pPr>
-      <w:r>
-        <w:t>La aplicación muestra el nombre de la red junto con su ciudad y si tiene o no bicicletas eléctricas.</w:t>
+        <w:spacing w:after="120" w:line="240" w:lineRule="auto"/>
+        <w:jc w:val="both"/>
+        <w:rPr>
+          <w:rFonts w:eastAsiaTheme="minorHAnsi" w:cs="Calibri"/>
+        </w:rPr>
+      </w:pPr>
+      <w:r>
+        <w:rPr>
+          <w:rFonts w:eastAsiaTheme="minorHAnsi" w:cs="Calibri"/>
+        </w:rPr>
+        <w:t>La aplicación muestra los posibles tipos de incidencia.</w:t>
       </w:r>
     </w:p>
     <w:p>
@@ -196,19 +227,22 @@
         <w:pStyle w:val="Prrafodelista"/>
         <w:numPr>
           <w:ilvl w:val="0"/>
-          <w:numId w:val="2"/>
+          <w:numId w:val="17"/>
         </w:numPr>
-        <w:tabs>
-          <w:tab w:val="clear" w:pos="720"/>
-        </w:tabs>
         <w:autoSpaceDE w:val="0"/>
         <w:autoSpaceDN w:val="0"/>
         <w:adjustRightInd w:val="0"/>
-        <w:spacing w:after="0" w:line="240" w:lineRule="auto"/>
-        <w:ind w:left="1068"/>
-      </w:pPr>
-      <w:r>
-        <w:t>Se verifica que los datos mostrados de la red son correctos.</w:t>
+        <w:spacing w:after="120" w:line="240" w:lineRule="auto"/>
+        <w:jc w:val="both"/>
+        <w:rPr>
+          <w:rFonts w:eastAsiaTheme="minorHAnsi" w:cs="Calibri"/>
+        </w:rPr>
+      </w:pPr>
+      <w:r>
+        <w:rPr>
+          <w:rFonts w:eastAsiaTheme="minorHAnsi" w:cs="Calibri"/>
+        </w:rPr>
+        <w:t>El técnico selecciona un tipo de incidencia predefinido.</w:t>
       </w:r>
     </w:p>
     <w:p>
@@ -216,19 +250,22 @@
         <w:pStyle w:val="Prrafodelista"/>
         <w:numPr>
           <w:ilvl w:val="0"/>
-          <w:numId w:val="2"/>
+          <w:numId w:val="17"/>
         </w:numPr>
-        <w:tabs>
-          <w:tab w:val="clear" w:pos="720"/>
-        </w:tabs>
         <w:autoSpaceDE w:val="0"/>
         <w:autoSpaceDN w:val="0"/>
         <w:adjustRightInd w:val="0"/>
-        <w:spacing w:after="0" w:line="240" w:lineRule="auto"/>
-        <w:ind w:left="1068"/>
-      </w:pPr>
-      <w:r>
-        <w:t>La aplicación muestra las estaciones pertenecientes a la red seleccionada, con su nombre y distancia desde la posición del técnico.</w:t>
+        <w:spacing w:after="120" w:line="240" w:lineRule="auto"/>
+        <w:jc w:val="both"/>
+        <w:rPr>
+          <w:rFonts w:eastAsiaTheme="minorHAnsi" w:cs="Calibri"/>
+        </w:rPr>
+      </w:pPr>
+      <w:r>
+        <w:rPr>
+          <w:rFonts w:eastAsiaTheme="minorHAnsi" w:cs="Calibri"/>
+        </w:rPr>
+        <w:t>La aplicación registra la incidencia de la estación en la base de datos.</w:t>
       </w:r>
     </w:p>
     <w:p>
@@ -236,25 +273,52 @@
         <w:pStyle w:val="Prrafodelista"/>
         <w:numPr>
           <w:ilvl w:val="0"/>
-          <w:numId w:val="2"/>
+          <w:numId w:val="17"/>
         </w:numPr>
-        <w:tabs>
-          <w:tab w:val="clear" w:pos="720"/>
-        </w:tabs>
         <w:autoSpaceDE w:val="0"/>
         <w:autoSpaceDN w:val="0"/>
         <w:adjustRightInd w:val="0"/>
-        <w:spacing w:after="0" w:line="240" w:lineRule="auto"/>
-        <w:ind w:left="1068"/>
-      </w:pPr>
-      <w:r>
-        <w:t>Se verifica que los datos mostrados de cada estación son correctos.</w:t>
-      </w:r>
-    </w:p>
-    <w:p/>
-    <w:p>
-      <w:r>
-        <w:t>Prueba 01. Red sin estaciones:</w:t>
+        <w:spacing w:after="120" w:line="240" w:lineRule="auto"/>
+        <w:jc w:val="both"/>
+        <w:rPr>
+          <w:rFonts w:eastAsiaTheme="minorHAnsi" w:cs="Calibri"/>
+        </w:rPr>
+      </w:pPr>
+      <w:r>
+        <w:rPr>
+          <w:rFonts w:eastAsiaTheme="minorHAnsi" w:cs="Calibri"/>
+        </w:rPr>
+        <w:t>Se verifica que la nueva incidencia se ha registrado en la base de datos.</w:t>
+      </w:r>
+    </w:p>
+    <w:p>
+      <w:pPr>
+        <w:autoSpaceDE w:val="0"/>
+        <w:autoSpaceDN w:val="0"/>
+        <w:adjustRightInd w:val="0"/>
+        <w:spacing w:after="120" w:line="240" w:lineRule="auto"/>
+        <w:jc w:val="both"/>
+        <w:rPr>
+          <w:rFonts w:eastAsiaTheme="minorHAnsi" w:cs="Calibri"/>
+        </w:rPr>
+      </w:pPr>
+    </w:p>
+    <w:p>
+      <w:pPr>
+        <w:autoSpaceDE w:val="0"/>
+        <w:autoSpaceDN w:val="0"/>
+        <w:adjustRightInd w:val="0"/>
+        <w:spacing w:after="120" w:line="240" w:lineRule="auto"/>
+        <w:jc w:val="both"/>
+        <w:rPr>
+          <w:rFonts w:eastAsiaTheme="minorHAnsi" w:cs="Calibri"/>
+        </w:rPr>
+      </w:pPr>
+      <w:r>
+        <w:rPr>
+          <w:rFonts w:eastAsiaTheme="minorHAnsi" w:cs="Calibri"/>
+        </w:rPr>
+        <w:t>Prueba 01. Éxito (Incidencia personalizada):</w:t>
       </w:r>
     </w:p>
     <w:p>
@@ -262,19 +326,22 @@
         <w:pStyle w:val="Prrafodelista"/>
         <w:numPr>
           <w:ilvl w:val="0"/>
-          <w:numId w:val="3"/>
+          <w:numId w:val="18"/>
         </w:numPr>
-        <w:tabs>
-          <w:tab w:val="clear" w:pos="720"/>
-        </w:tabs>
         <w:autoSpaceDE w:val="0"/>
         <w:autoSpaceDN w:val="0"/>
         <w:adjustRightInd w:val="0"/>
-        <w:spacing w:after="0" w:line="240" w:lineRule="auto"/>
-        <w:ind w:left="1068"/>
-      </w:pPr>
-      <w:r>
-        <w:t>El técnico selecciona una red de la lista de redes principal.</w:t>
+        <w:spacing w:after="120" w:line="240" w:lineRule="auto"/>
+        <w:jc w:val="both"/>
+        <w:rPr>
+          <w:rFonts w:eastAsiaTheme="minorHAnsi" w:cs="Calibri"/>
+        </w:rPr>
+      </w:pPr>
+      <w:r>
+        <w:rPr>
+          <w:rFonts w:eastAsiaTheme="minorHAnsi" w:cs="Calibri"/>
+        </w:rPr>
+        <w:t>El técnico selecciona crear una nueva incidencia de la estación.</w:t>
       </w:r>
     </w:p>
     <w:p>
@@ -282,19 +349,22 @@
         <w:pStyle w:val="Prrafodelista"/>
         <w:numPr>
           <w:ilvl w:val="0"/>
-          <w:numId w:val="3"/>
+          <w:numId w:val="18"/>
         </w:numPr>
-        <w:tabs>
-          <w:tab w:val="clear" w:pos="720"/>
-        </w:tabs>
         <w:autoSpaceDE w:val="0"/>
         <w:autoSpaceDN w:val="0"/>
         <w:adjustRightInd w:val="0"/>
-        <w:spacing w:after="0" w:line="240" w:lineRule="auto"/>
-        <w:ind w:left="1068"/>
-      </w:pPr>
-      <w:r>
-        <w:t>La aplicación muestra el nombre de la red junto con su ciudad y si tiene o no bicicletas eléctricas.</w:t>
+        <w:spacing w:after="120" w:line="240" w:lineRule="auto"/>
+        <w:jc w:val="both"/>
+        <w:rPr>
+          <w:rFonts w:eastAsiaTheme="minorHAnsi" w:cs="Calibri"/>
+        </w:rPr>
+      </w:pPr>
+      <w:r>
+        <w:rPr>
+          <w:rFonts w:eastAsiaTheme="minorHAnsi" w:cs="Calibri"/>
+        </w:rPr>
+        <w:t>La aplicación muestra los posibles tipos de incidencia.</w:t>
       </w:r>
     </w:p>
     <w:p>
@@ -302,19 +372,22 @@
         <w:pStyle w:val="Prrafodelista"/>
         <w:numPr>
           <w:ilvl w:val="0"/>
-          <w:numId w:val="3"/>
+          <w:numId w:val="18"/>
         </w:numPr>
-        <w:tabs>
-          <w:tab w:val="clear" w:pos="720"/>
-        </w:tabs>
         <w:autoSpaceDE w:val="0"/>
         <w:autoSpaceDN w:val="0"/>
         <w:adjustRightInd w:val="0"/>
-        <w:spacing w:after="0" w:line="240" w:lineRule="auto"/>
-        <w:ind w:left="1068"/>
-      </w:pPr>
-      <w:r>
-        <w:t>Se verifica que los datos mostrados de la red son correctos.</w:t>
+        <w:spacing w:after="120" w:line="240" w:lineRule="auto"/>
+        <w:jc w:val="both"/>
+        <w:rPr>
+          <w:rFonts w:eastAsiaTheme="minorHAnsi" w:cs="Calibri"/>
+        </w:rPr>
+      </w:pPr>
+      <w:r>
+        <w:rPr>
+          <w:rFonts w:eastAsiaTheme="minorHAnsi" w:cs="Calibri"/>
+        </w:rPr>
+        <w:t>El técnico selecciona el tipo de incidencia personalizado.</w:t>
       </w:r>
     </w:p>
     <w:p>
@@ -322,19 +395,22 @@
         <w:pStyle w:val="Prrafodelista"/>
         <w:numPr>
           <w:ilvl w:val="0"/>
-          <w:numId w:val="3"/>
+          <w:numId w:val="18"/>
         </w:numPr>
-        <w:tabs>
-          <w:tab w:val="clear" w:pos="720"/>
-        </w:tabs>
         <w:autoSpaceDE w:val="0"/>
         <w:autoSpaceDN w:val="0"/>
         <w:adjustRightInd w:val="0"/>
-        <w:spacing w:after="0" w:line="240" w:lineRule="auto"/>
-        <w:ind w:left="1068"/>
-      </w:pPr>
-      <w:r>
-        <w:t>La aplicación detecta que la red seleccionada no cuenta con estaciones.</w:t>
+        <w:spacing w:after="120" w:line="240" w:lineRule="auto"/>
+        <w:jc w:val="both"/>
+        <w:rPr>
+          <w:rFonts w:eastAsiaTheme="minorHAnsi" w:cs="Calibri"/>
+        </w:rPr>
+      </w:pPr>
+      <w:r>
+        <w:rPr>
+          <w:rFonts w:eastAsiaTheme="minorHAnsi" w:cs="Calibri"/>
+        </w:rPr>
+        <w:t>La aplicación solicita al técnico la descripción de la incidencia.</w:t>
       </w:r>
     </w:p>
     <w:p>
@@ -342,30 +418,22 @@
         <w:pStyle w:val="Prrafodelista"/>
         <w:numPr>
           <w:ilvl w:val="0"/>
-          <w:numId w:val="3"/>
+          <w:numId w:val="18"/>
         </w:numPr>
-        <w:tabs>
-          <w:tab w:val="clear" w:pos="720"/>
-        </w:tabs>
         <w:autoSpaceDE w:val="0"/>
         <w:autoSpaceDN w:val="0"/>
         <w:adjustRightInd w:val="0"/>
-        <w:spacing w:after="0" w:line="240" w:lineRule="auto"/>
-        <w:ind w:left="1068"/>
-      </w:pPr>
-      <w:r>
-        <w:t>Se verifica que la aplicación notifica al técnico que la red seleccionada no cuenta con estaciones.</w:t>
-      </w:r>
-    </w:p>
-    <w:p/>
-    <w:p>
-      <w:r>
-        <w:t>Prueba 02. Datos ausentes:</w:t>
-      </w:r>
-    </w:p>
-    <w:p>
-      <w:r>
-        <w:t>Nota: Esto quiere decir que alguno de los datos de la red o de las estaciones no está disponible en el servicio.</w:t>
+        <w:spacing w:after="120" w:line="240" w:lineRule="auto"/>
+        <w:jc w:val="both"/>
+        <w:rPr>
+          <w:rFonts w:eastAsiaTheme="minorHAnsi" w:cs="Calibri"/>
+        </w:rPr>
+      </w:pPr>
+      <w:r>
+        <w:rPr>
+          <w:rFonts w:eastAsiaTheme="minorHAnsi" w:cs="Calibri"/>
+        </w:rPr>
+        <w:t>El técnico introduce en la aplicación la descripción de la incidencia.</w:t>
       </w:r>
     </w:p>
     <w:p>
@@ -373,19 +441,22 @@
         <w:pStyle w:val="Prrafodelista"/>
         <w:numPr>
           <w:ilvl w:val="0"/>
-          <w:numId w:val="4"/>
+          <w:numId w:val="18"/>
         </w:numPr>
-        <w:tabs>
-          <w:tab w:val="clear" w:pos="720"/>
-        </w:tabs>
         <w:autoSpaceDE w:val="0"/>
         <w:autoSpaceDN w:val="0"/>
         <w:adjustRightInd w:val="0"/>
-        <w:spacing w:after="0" w:line="240" w:lineRule="auto"/>
-        <w:ind w:left="1068"/>
-      </w:pPr>
-      <w:r>
-        <w:t>El técnico selecciona una red de la lista de redes principal.</w:t>
+        <w:spacing w:after="120" w:line="240" w:lineRule="auto"/>
+        <w:jc w:val="both"/>
+        <w:rPr>
+          <w:rFonts w:eastAsiaTheme="minorHAnsi" w:cs="Calibri"/>
+        </w:rPr>
+      </w:pPr>
+      <w:r>
+        <w:rPr>
+          <w:rFonts w:eastAsiaTheme="minorHAnsi" w:cs="Calibri"/>
+        </w:rPr>
+        <w:t>La aplicación registra la incidencia de la estación en la base de datos.</w:t>
       </w:r>
     </w:p>
     <w:p>
@@ -393,19 +464,52 @@
         <w:pStyle w:val="Prrafodelista"/>
         <w:numPr>
           <w:ilvl w:val="0"/>
-          <w:numId w:val="4"/>
+          <w:numId w:val="18"/>
         </w:numPr>
-        <w:tabs>
-          <w:tab w:val="clear" w:pos="720"/>
-        </w:tabs>
         <w:autoSpaceDE w:val="0"/>
         <w:autoSpaceDN w:val="0"/>
         <w:adjustRightInd w:val="0"/>
-        <w:spacing w:after="0" w:line="240" w:lineRule="auto"/>
-        <w:ind w:left="1068"/>
-      </w:pPr>
-      <w:r>
-        <w:t>La aplicación detecta que hay datos de la red ausentes.</w:t>
+        <w:spacing w:after="120" w:line="240" w:lineRule="auto"/>
+        <w:jc w:val="both"/>
+        <w:rPr>
+          <w:rFonts w:eastAsiaTheme="minorHAnsi" w:cs="Calibri"/>
+        </w:rPr>
+      </w:pPr>
+      <w:r>
+        <w:rPr>
+          <w:rFonts w:eastAsiaTheme="minorHAnsi" w:cs="Calibri"/>
+        </w:rPr>
+        <w:t>Se verifica que la nueva incidencia se ha registrado en la base de datos.</w:t>
+      </w:r>
+    </w:p>
+    <w:p>
+      <w:pPr>
+        <w:autoSpaceDE w:val="0"/>
+        <w:autoSpaceDN w:val="0"/>
+        <w:adjustRightInd w:val="0"/>
+        <w:spacing w:after="120" w:line="240" w:lineRule="auto"/>
+        <w:jc w:val="both"/>
+        <w:rPr>
+          <w:rFonts w:eastAsiaTheme="minorHAnsi" w:cs="Calibri"/>
+        </w:rPr>
+      </w:pPr>
+    </w:p>
+    <w:p>
+      <w:pPr>
+        <w:autoSpaceDE w:val="0"/>
+        <w:autoSpaceDN w:val="0"/>
+        <w:adjustRightInd w:val="0"/>
+        <w:spacing w:after="120" w:line="240" w:lineRule="auto"/>
+        <w:jc w:val="both"/>
+        <w:rPr>
+          <w:rFonts w:eastAsiaTheme="minorHAnsi" w:cs="Calibri"/>
+        </w:rPr>
+      </w:pPr>
+      <w:r>
+        <w:rPr>
+          <w:rFonts w:eastAsiaTheme="minorHAnsi" w:cs="Calibri"/>
+        </w:rPr>
+        <w:t>Prueba 02. Base de datos no disponible:</w:t>
       </w:r>
     </w:p>
     <w:p>
@@ -413,19 +517,22 @@
         <w:pStyle w:val="Prrafodelista"/>
         <w:numPr>
           <w:ilvl w:val="0"/>
-          <w:numId w:val="4"/>
+          <w:numId w:val="19"/>
         </w:numPr>
-        <w:tabs>
-          <w:tab w:val="clear" w:pos="720"/>
-        </w:tabs>
         <w:autoSpaceDE w:val="0"/>
         <w:autoSpaceDN w:val="0"/>
         <w:adjustRightInd w:val="0"/>
-        <w:spacing w:after="0" w:line="240" w:lineRule="auto"/>
-        <w:ind w:left="1068"/>
-      </w:pPr>
-      <w:r>
-        <w:t>La aplicación muestra los datos disponibles de la red.</w:t>
+        <w:spacing w:after="120" w:line="240" w:lineRule="auto"/>
+        <w:jc w:val="both"/>
+        <w:rPr>
+          <w:rFonts w:eastAsiaTheme="minorHAnsi" w:cs="Calibri"/>
+        </w:rPr>
+      </w:pPr>
+      <w:r>
+        <w:rPr>
+          <w:rFonts w:eastAsiaTheme="minorHAnsi" w:cs="Calibri"/>
+        </w:rPr>
+        <w:t>El técnico selecciona crear una nueva incidencia de la estación.</w:t>
       </w:r>
     </w:p>
     <w:p>
@@ -433,19 +540,22 @@
         <w:pStyle w:val="Prrafodelista"/>
         <w:numPr>
           <w:ilvl w:val="0"/>
-          <w:numId w:val="4"/>
+          <w:numId w:val="19"/>
         </w:numPr>
-        <w:tabs>
-          <w:tab w:val="clear" w:pos="720"/>
-        </w:tabs>
         <w:autoSpaceDE w:val="0"/>
         <w:autoSpaceDN w:val="0"/>
         <w:adjustRightInd w:val="0"/>
-        <w:spacing w:after="0" w:line="240" w:lineRule="auto"/>
-        <w:ind w:left="1068"/>
-      </w:pPr>
-      <w:r>
-        <w:t>Se verifica que los datos mostrados de la red son correctos.</w:t>
+        <w:spacing w:after="120" w:line="240" w:lineRule="auto"/>
+        <w:jc w:val="both"/>
+        <w:rPr>
+          <w:rFonts w:eastAsiaTheme="minorHAnsi" w:cs="Calibri"/>
+        </w:rPr>
+      </w:pPr>
+      <w:r>
+        <w:rPr>
+          <w:rFonts w:eastAsiaTheme="minorHAnsi" w:cs="Calibri"/>
+        </w:rPr>
+        <w:t>La aplicación muestra los posibles tipos de incidencia.</w:t>
       </w:r>
     </w:p>
     <w:p>
@@ -453,19 +563,22 @@
         <w:pStyle w:val="Prrafodelista"/>
         <w:numPr>
           <w:ilvl w:val="0"/>
-          <w:numId w:val="4"/>
+          <w:numId w:val="19"/>
         </w:numPr>
-        <w:tabs>
-          <w:tab w:val="clear" w:pos="720"/>
-        </w:tabs>
         <w:autoSpaceDE w:val="0"/>
         <w:autoSpaceDN w:val="0"/>
         <w:adjustRightInd w:val="0"/>
-        <w:spacing w:after="0" w:line="240" w:lineRule="auto"/>
-        <w:ind w:left="1068"/>
-      </w:pPr>
-      <w:r>
-        <w:t>Se verifica que para los datos no disponibles de la red se muestra un guion (indicando que el dato no está disponible).</w:t>
+        <w:spacing w:after="120" w:line="240" w:lineRule="auto"/>
+        <w:jc w:val="both"/>
+        <w:rPr>
+          <w:rFonts w:eastAsiaTheme="minorHAnsi" w:cs="Calibri"/>
+        </w:rPr>
+      </w:pPr>
+      <w:r>
+        <w:rPr>
+          <w:rFonts w:eastAsiaTheme="minorHAnsi" w:cs="Calibri"/>
+        </w:rPr>
+        <w:t>El técnico selecciona un tipo de incidencia predefinido.</w:t>
       </w:r>
     </w:p>
     <w:p>
@@ -473,19 +586,22 @@
         <w:pStyle w:val="Prrafodelista"/>
         <w:numPr>
           <w:ilvl w:val="0"/>
-          <w:numId w:val="4"/>
+          <w:numId w:val="19"/>
         </w:numPr>
-        <w:tabs>
-          <w:tab w:val="clear" w:pos="720"/>
-        </w:tabs>
         <w:autoSpaceDE w:val="0"/>
         <w:autoSpaceDN w:val="0"/>
         <w:adjustRightInd w:val="0"/>
-        <w:spacing w:after="0" w:line="240" w:lineRule="auto"/>
-        <w:ind w:left="1068"/>
-      </w:pPr>
-      <w:r>
-        <w:t>La aplicación detecta que hay datos de alguna estación ausentes.</w:t>
+        <w:spacing w:after="120" w:line="240" w:lineRule="auto"/>
+        <w:jc w:val="both"/>
+        <w:rPr>
+          <w:rFonts w:eastAsiaTheme="minorHAnsi" w:cs="Calibri"/>
+        </w:rPr>
+      </w:pPr>
+      <w:r>
+        <w:rPr>
+          <w:rFonts w:eastAsiaTheme="minorHAnsi" w:cs="Calibri"/>
+        </w:rPr>
+        <w:t>La aplicación detecta que la base de datos no está disponible.</w:t>
       </w:r>
     </w:p>
     <w:p>
@@ -493,19 +609,22 @@
         <w:pStyle w:val="Prrafodelista"/>
         <w:numPr>
           <w:ilvl w:val="0"/>
-          <w:numId w:val="4"/>
+          <w:numId w:val="19"/>
         </w:numPr>
-        <w:tabs>
-          <w:tab w:val="clear" w:pos="720"/>
-        </w:tabs>
         <w:autoSpaceDE w:val="0"/>
         <w:autoSpaceDN w:val="0"/>
         <w:adjustRightInd w:val="0"/>
-        <w:spacing w:after="0" w:line="240" w:lineRule="auto"/>
-        <w:ind w:left="1068"/>
-      </w:pPr>
-      <w:r>
-        <w:t>La aplicación muestra las estaciones pertenecientes a la red seleccionada, con sus datos disponibles.</w:t>
+        <w:spacing w:after="120" w:line="240" w:lineRule="auto"/>
+        <w:jc w:val="both"/>
+        <w:rPr>
+          <w:rFonts w:eastAsiaTheme="minorHAnsi" w:cs="Calibri"/>
+        </w:rPr>
+      </w:pPr>
+      <w:r>
+        <w:rPr>
+          <w:rFonts w:eastAsiaTheme="minorHAnsi" w:cs="Calibri"/>
+        </w:rPr>
+        <w:t>La aplicación notifica al técnico que ha ocurrido un error genérico.</w:t>
       </w:r>
     </w:p>
     <w:p>
@@ -513,19 +632,52 @@
         <w:pStyle w:val="Prrafodelista"/>
         <w:numPr>
           <w:ilvl w:val="0"/>
-          <w:numId w:val="4"/>
+          <w:numId w:val="19"/>
         </w:numPr>
-        <w:tabs>
-          <w:tab w:val="clear" w:pos="720"/>
-        </w:tabs>
         <w:autoSpaceDE w:val="0"/>
         <w:autoSpaceDN w:val="0"/>
         <w:adjustRightInd w:val="0"/>
-        <w:spacing w:after="0" w:line="240" w:lineRule="auto"/>
-        <w:ind w:left="1068"/>
-      </w:pPr>
-      <w:r>
-        <w:t>Se verifica que los datos mostrados de cada estación son correctos.</w:t>
+        <w:spacing w:after="120" w:line="240" w:lineRule="auto"/>
+        <w:jc w:val="both"/>
+        <w:rPr>
+          <w:rFonts w:eastAsiaTheme="minorHAnsi" w:cs="Calibri"/>
+        </w:rPr>
+      </w:pPr>
+      <w:r>
+        <w:rPr>
+          <w:rFonts w:eastAsiaTheme="minorHAnsi" w:cs="Calibri"/>
+        </w:rPr>
+        <w:t>Se verifica que se ha notificado al técnico que ha ocurrido un error genérico.</w:t>
+      </w:r>
+    </w:p>
+    <w:p>
+      <w:pPr>
+        <w:autoSpaceDE w:val="0"/>
+        <w:autoSpaceDN w:val="0"/>
+        <w:adjustRightInd w:val="0"/>
+        <w:spacing w:after="120" w:line="240" w:lineRule="auto"/>
+        <w:jc w:val="both"/>
+        <w:rPr>
+          <w:rFonts w:eastAsiaTheme="minorHAnsi" w:cs="Calibri"/>
+        </w:rPr>
+      </w:pPr>
+    </w:p>
+    <w:p>
+      <w:pPr>
+        <w:autoSpaceDE w:val="0"/>
+        <w:autoSpaceDN w:val="0"/>
+        <w:adjustRightInd w:val="0"/>
+        <w:spacing w:after="120" w:line="240" w:lineRule="auto"/>
+        <w:jc w:val="both"/>
+        <w:rPr>
+          <w:rFonts w:eastAsiaTheme="minorHAnsi" w:cs="Calibri"/>
+        </w:rPr>
+      </w:pPr>
+      <w:r>
+        <w:rPr>
+          <w:rFonts w:eastAsiaTheme="minorHAnsi" w:cs="Calibri"/>
+        </w:rPr>
+        <w:t>Prueba 03. Error al comunicarse con la base de datos:</w:t>
       </w:r>
     </w:p>
     <w:p>
@@ -533,25 +685,22 @@
         <w:pStyle w:val="Prrafodelista"/>
         <w:numPr>
           <w:ilvl w:val="0"/>
-          <w:numId w:val="4"/>
+          <w:numId w:val="20"/>
         </w:numPr>
-        <w:tabs>
-          <w:tab w:val="clear" w:pos="720"/>
-        </w:tabs>
         <w:autoSpaceDE w:val="0"/>
         <w:autoSpaceDN w:val="0"/>
         <w:adjustRightInd w:val="0"/>
-        <w:spacing w:after="0" w:line="240" w:lineRule="auto"/>
-        <w:ind w:left="1068"/>
-      </w:pPr>
-      <w:r>
-        <w:t>Se verifica que para los datos no disponibles de cada estación se muestra un guion (indicando que el dato no está disponible).</w:t>
-      </w:r>
-    </w:p>
-    <w:p/>
-    <w:p>
-      <w:r>
-        <w:t>Prueba 03. Geolocalización no disponible:</w:t>
+        <w:spacing w:after="120" w:line="240" w:lineRule="auto"/>
+        <w:jc w:val="both"/>
+        <w:rPr>
+          <w:rFonts w:eastAsiaTheme="minorHAnsi" w:cs="Calibri"/>
+        </w:rPr>
+      </w:pPr>
+      <w:r>
+        <w:rPr>
+          <w:rFonts w:eastAsiaTheme="minorHAnsi" w:cs="Calibri"/>
+        </w:rPr>
+        <w:t>El técnico selecciona crear una nueva incidencia de la estación.</w:t>
       </w:r>
     </w:p>
     <w:p>
@@ -559,19 +708,22 @@
         <w:pStyle w:val="Prrafodelista"/>
         <w:numPr>
           <w:ilvl w:val="0"/>
-          <w:numId w:val="5"/>
+          <w:numId w:val="20"/>
         </w:numPr>
-        <w:tabs>
-          <w:tab w:val="clear" w:pos="720"/>
-        </w:tabs>
         <w:autoSpaceDE w:val="0"/>
         <w:autoSpaceDN w:val="0"/>
         <w:adjustRightInd w:val="0"/>
-        <w:spacing w:after="0" w:line="240" w:lineRule="auto"/>
-        <w:ind w:left="1068"/>
-      </w:pPr>
-      <w:r>
-        <w:t>El técnico selecciona una red de la lista de redes principal.</w:t>
+        <w:spacing w:after="120" w:line="240" w:lineRule="auto"/>
+        <w:jc w:val="both"/>
+        <w:rPr>
+          <w:rFonts w:eastAsiaTheme="minorHAnsi" w:cs="Calibri"/>
+        </w:rPr>
+      </w:pPr>
+      <w:r>
+        <w:rPr>
+          <w:rFonts w:eastAsiaTheme="minorHAnsi" w:cs="Calibri"/>
+        </w:rPr>
+        <w:t>La aplicación muestra los posibles tipos de incidencia.</w:t>
       </w:r>
     </w:p>
     <w:p>
@@ -579,20 +731,22 @@
         <w:pStyle w:val="Prrafodelista"/>
         <w:numPr>
           <w:ilvl w:val="0"/>
-          <w:numId w:val="5"/>
+          <w:numId w:val="20"/>
         </w:numPr>
-        <w:tabs>
-          <w:tab w:val="clear" w:pos="720"/>
-        </w:tabs>
         <w:autoSpaceDE w:val="0"/>
         <w:autoSpaceDN w:val="0"/>
         <w:adjustRightInd w:val="0"/>
-        <w:spacing w:after="0" w:line="240" w:lineRule="auto"/>
-        <w:ind w:left="1068"/>
-      </w:pPr>
-      <w:r>
-        <w:lastRenderedPageBreak/>
-        <w:t>La aplicación muestra el nombre de la red junto con su ciudad y si tiene o no bicicletas eléctricas.</w:t>
+        <w:spacing w:after="120" w:line="240" w:lineRule="auto"/>
+        <w:jc w:val="both"/>
+        <w:rPr>
+          <w:rFonts w:eastAsiaTheme="minorHAnsi" w:cs="Calibri"/>
+        </w:rPr>
+      </w:pPr>
+      <w:r>
+        <w:rPr>
+          <w:rFonts w:eastAsiaTheme="minorHAnsi" w:cs="Calibri"/>
+        </w:rPr>
+        <w:t>El técnico selecciona un tipo de incidencia predefinido.</w:t>
       </w:r>
     </w:p>
     <w:p>
@@ -600,19 +754,22 @@
         <w:pStyle w:val="Prrafodelista"/>
         <w:numPr>
           <w:ilvl w:val="0"/>
-          <w:numId w:val="5"/>
+          <w:numId w:val="20"/>
         </w:numPr>
-        <w:tabs>
-          <w:tab w:val="clear" w:pos="720"/>
-        </w:tabs>
         <w:autoSpaceDE w:val="0"/>
         <w:autoSpaceDN w:val="0"/>
         <w:adjustRightInd w:val="0"/>
-        <w:spacing w:after="0" w:line="240" w:lineRule="auto"/>
-        <w:ind w:left="1068"/>
-      </w:pPr>
-      <w:r>
-        <w:t>Se verifica que los datos mostrados de la red son correctos.</w:t>
+        <w:spacing w:after="120" w:line="240" w:lineRule="auto"/>
+        <w:jc w:val="both"/>
+        <w:rPr>
+          <w:rFonts w:eastAsiaTheme="minorHAnsi" w:cs="Calibri"/>
+        </w:rPr>
+      </w:pPr>
+      <w:r>
+        <w:rPr>
+          <w:rFonts w:eastAsiaTheme="minorHAnsi" w:cs="Calibri"/>
+        </w:rPr>
+        <w:t>La aplicación detecta que no se puede comunicar con la base de datos.</w:t>
       </w:r>
     </w:p>
     <w:p>
@@ -620,19 +777,22 @@
         <w:pStyle w:val="Prrafodelista"/>
         <w:numPr>
           <w:ilvl w:val="0"/>
-          <w:numId w:val="5"/>
+          <w:numId w:val="20"/>
         </w:numPr>
-        <w:tabs>
-          <w:tab w:val="clear" w:pos="720"/>
-        </w:tabs>
         <w:autoSpaceDE w:val="0"/>
         <w:autoSpaceDN w:val="0"/>
         <w:adjustRightInd w:val="0"/>
-        <w:spacing w:after="0" w:line="240" w:lineRule="auto"/>
-        <w:ind w:left="1068"/>
-      </w:pPr>
-      <w:r>
-        <w:t>La aplicación detecta que la geolocalización del dispositivo del técnico está desactivada.</w:t>
+        <w:spacing w:after="120" w:line="240" w:lineRule="auto"/>
+        <w:jc w:val="both"/>
+        <w:rPr>
+          <w:rFonts w:eastAsiaTheme="minorHAnsi" w:cs="Calibri"/>
+        </w:rPr>
+      </w:pPr>
+      <w:r>
+        <w:rPr>
+          <w:rFonts w:eastAsiaTheme="minorHAnsi" w:cs="Calibri"/>
+        </w:rPr>
+        <w:t>La aplicación notifica al técnico que ha ocurrido un error genérico.</w:t>
       </w:r>
     </w:p>
     <w:p>
@@ -640,286 +800,96 @@
         <w:pStyle w:val="Prrafodelista"/>
         <w:numPr>
           <w:ilvl w:val="0"/>
-          <w:numId w:val="5"/>
+          <w:numId w:val="20"/>
         </w:numPr>
-        <w:tabs>
-          <w:tab w:val="clear" w:pos="720"/>
-        </w:tabs>
         <w:autoSpaceDE w:val="0"/>
         <w:autoSpaceDN w:val="0"/>
         <w:adjustRightInd w:val="0"/>
-        <w:spacing w:after="0" w:line="240" w:lineRule="auto"/>
-        <w:ind w:left="1068"/>
-      </w:pPr>
-      <w:r>
-        <w:t>La aplicación muestra las estaciones pertenecientes a la red seleccionada, con su nombre.</w:t>
-      </w:r>
-    </w:p>
-    <w:p>
-      <w:pPr>
-        <w:pStyle w:val="Prrafodelista"/>
-        <w:numPr>
-          <w:ilvl w:val="0"/>
-          <w:numId w:val="5"/>
-        </w:numPr>
-        <w:tabs>
-          <w:tab w:val="clear" w:pos="720"/>
-        </w:tabs>
+        <w:spacing w:after="120" w:line="240" w:lineRule="auto"/>
+        <w:jc w:val="both"/>
+        <w:rPr>
+          <w:rFonts w:eastAsiaTheme="minorHAnsi" w:cs="Calibri"/>
+        </w:rPr>
+      </w:pPr>
+      <w:r>
+        <w:rPr>
+          <w:rFonts w:eastAsiaTheme="minorHAnsi" w:cs="Calibri"/>
+        </w:rPr>
+        <w:t>Se verifica que se ha notificado al técnico que ha ocurrido un error genérico.</w:t>
+      </w:r>
+    </w:p>
+    <w:p>
+      <w:pPr>
         <w:autoSpaceDE w:val="0"/>
         <w:autoSpaceDN w:val="0"/>
         <w:adjustRightInd w:val="0"/>
-        <w:spacing w:after="0" w:line="240" w:lineRule="auto"/>
-        <w:ind w:left="1068"/>
-      </w:pPr>
-      <w:r>
-        <w:t>Se verifica que los datos mostrados de cada estación son correctos.</w:t>
-      </w:r>
-    </w:p>
-    <w:p>
-      <w:pPr>
-        <w:pStyle w:val="Prrafodelista"/>
-        <w:numPr>
-          <w:ilvl w:val="0"/>
-          <w:numId w:val="5"/>
-        </w:numPr>
-        <w:tabs>
-          <w:tab w:val="clear" w:pos="720"/>
-        </w:tabs>
+        <w:spacing w:after="120" w:line="240" w:lineRule="auto"/>
+        <w:jc w:val="both"/>
+        <w:rPr>
+          <w:rFonts w:eastAsiaTheme="minorHAnsi" w:cs="Calibri"/>
+        </w:rPr>
+      </w:pPr>
+    </w:p>
+    <w:p>
+      <w:pPr>
         <w:autoSpaceDE w:val="0"/>
         <w:autoSpaceDN w:val="0"/>
         <w:adjustRightInd w:val="0"/>
-        <w:spacing w:after="0" w:line="240" w:lineRule="auto"/>
-        <w:ind w:left="1068"/>
-      </w:pPr>
-      <w:r>
-        <w:t>Se verifica que en lugar de la distancia a cada estación se muestra un guion (indicando que el dato no está disponible).</w:t>
-      </w:r>
-    </w:p>
-    <w:p>
-      <w:pPr>
-        <w:pStyle w:val="Prrafodelista"/>
-        <w:numPr>
-          <w:ilvl w:val="0"/>
-          <w:numId w:val="5"/>
-        </w:numPr>
-        <w:tabs>
-          <w:tab w:val="clear" w:pos="720"/>
-        </w:tabs>
+        <w:spacing w:after="120" w:line="240" w:lineRule="auto"/>
+        <w:jc w:val="both"/>
+        <w:rPr>
+          <w:rFonts w:eastAsiaTheme="minorHAnsi" w:cs="Calibri"/>
+        </w:rPr>
+      </w:pPr>
+      <w:r>
+        <w:rPr>
+          <w:rFonts w:eastAsiaTheme="minorHAnsi" w:cs="Calibri"/>
+        </w:rPr>
+        <w:t>Nota: Las pruebas 02 y 03 incluyen tanto el caso en el que se desea crear una incidencia de tipo predefinido como de tipo personalizado, por simplicidad, se detalla solo el caso del tipo predefinido, pero el comportamiento sería el mismo.</w:t>
+      </w:r>
+    </w:p>
+    <w:p>
+      <w:pPr>
+        <w:rPr>
+          <w:rFonts w:eastAsiaTheme="minorHAnsi" w:cs="Calibri"/>
+        </w:rPr>
+      </w:pPr>
+      <w:r>
+        <w:rPr>
+          <w:rFonts w:eastAsiaTheme="minorHAnsi" w:cs="Calibri"/>
+        </w:rPr>
+        <w:br w:type="page"/>
+      </w:r>
+    </w:p>
+    <w:p>
+      <w:pPr>
         <w:autoSpaceDE w:val="0"/>
         <w:autoSpaceDN w:val="0"/>
         <w:adjustRightInd w:val="0"/>
-        <w:spacing w:after="0" w:line="240" w:lineRule="auto"/>
-        <w:ind w:left="1068"/>
-      </w:pPr>
-      <w:r>
-        <w:t>Se verifica que la aplicación notifica al técnico que la geolocalización está desactivada.</w:t>
-      </w:r>
-    </w:p>
-    <w:p/>
-    <w:p>
-      <w:r>
-        <w:t>Prueba 04. Servicio de datos no disponible:</w:t>
-      </w:r>
-    </w:p>
-    <w:p>
-      <w:pPr>
-        <w:pStyle w:val="Prrafodelista"/>
-        <w:numPr>
-          <w:ilvl w:val="0"/>
-          <w:numId w:val="6"/>
-        </w:numPr>
-        <w:tabs>
-          <w:tab w:val="clear" w:pos="720"/>
-        </w:tabs>
-        <w:autoSpaceDE w:val="0"/>
-        <w:autoSpaceDN w:val="0"/>
-        <w:adjustRightInd w:val="0"/>
-        <w:spacing w:after="0" w:line="240" w:lineRule="auto"/>
-        <w:ind w:left="1068"/>
-      </w:pPr>
-      <w:r>
-        <w:t>El técnico selecciona una red de la lista de redes principal.</w:t>
-      </w:r>
-    </w:p>
-    <w:p>
-      <w:pPr>
-        <w:pStyle w:val="Prrafodelista"/>
-        <w:numPr>
-          <w:ilvl w:val="0"/>
-          <w:numId w:val="6"/>
-        </w:numPr>
-        <w:tabs>
-          <w:tab w:val="clear" w:pos="720"/>
-        </w:tabs>
-        <w:autoSpaceDE w:val="0"/>
-        <w:autoSpaceDN w:val="0"/>
-        <w:adjustRightInd w:val="0"/>
-        <w:spacing w:after="0" w:line="240" w:lineRule="auto"/>
-        <w:ind w:left="1068"/>
-      </w:pPr>
-      <w:r>
-        <w:t>La aplicación detecta que el servicio de datos no responde.</w:t>
-      </w:r>
-    </w:p>
-    <w:p>
-      <w:pPr>
-        <w:pStyle w:val="Prrafodelista"/>
-        <w:numPr>
-          <w:ilvl w:val="0"/>
-          <w:numId w:val="6"/>
-        </w:numPr>
-        <w:tabs>
-          <w:tab w:val="clear" w:pos="720"/>
-        </w:tabs>
-        <w:autoSpaceDE w:val="0"/>
-        <w:autoSpaceDN w:val="0"/>
-        <w:adjustRightInd w:val="0"/>
-        <w:spacing w:after="0" w:line="240" w:lineRule="auto"/>
-        <w:ind w:left="1068"/>
-      </w:pPr>
-      <w:r>
-        <w:t>Se verifica que la aplicación notifica al técnico que ha habido un error interno.</w:t>
-      </w:r>
-    </w:p>
-    <w:p/>
-    <w:p>
-      <w:r>
-        <w:t>Prueba 05. Error al comunicarse con el servicio de datos:</w:t>
-      </w:r>
-    </w:p>
-    <w:p>
-      <w:pPr>
-        <w:pStyle w:val="Prrafodelista"/>
-        <w:numPr>
-          <w:ilvl w:val="0"/>
-          <w:numId w:val="7"/>
-        </w:numPr>
-        <w:tabs>
-          <w:tab w:val="clear" w:pos="720"/>
-        </w:tabs>
-        <w:autoSpaceDE w:val="0"/>
-        <w:autoSpaceDN w:val="0"/>
-        <w:adjustRightInd w:val="0"/>
-        <w:spacing w:after="0" w:line="240" w:lineRule="auto"/>
-        <w:ind w:left="1068"/>
-      </w:pPr>
-      <w:r>
-        <w:t>El técnico selecciona una red de la lista de redes principal.</w:t>
-      </w:r>
-    </w:p>
-    <w:p>
-      <w:pPr>
-        <w:pStyle w:val="Prrafodelista"/>
-        <w:numPr>
-          <w:ilvl w:val="0"/>
-          <w:numId w:val="7"/>
-        </w:numPr>
-        <w:tabs>
-          <w:tab w:val="clear" w:pos="720"/>
-        </w:tabs>
-        <w:autoSpaceDE w:val="0"/>
-        <w:autoSpaceDN w:val="0"/>
-        <w:adjustRightInd w:val="0"/>
-        <w:spacing w:after="0" w:line="240" w:lineRule="auto"/>
-        <w:ind w:left="1068"/>
-      </w:pPr>
-      <w:r>
-        <w:t>La aplicación detecta que ha ocurrido un error al acceder al servicio de datos.</w:t>
-      </w:r>
-    </w:p>
-    <w:p>
-      <w:pPr>
-        <w:pStyle w:val="Prrafodelista"/>
-        <w:numPr>
-          <w:ilvl w:val="0"/>
-          <w:numId w:val="7"/>
-        </w:numPr>
-        <w:tabs>
-          <w:tab w:val="clear" w:pos="720"/>
-        </w:tabs>
-        <w:autoSpaceDE w:val="0"/>
-        <w:autoSpaceDN w:val="0"/>
-        <w:adjustRightInd w:val="0"/>
-        <w:spacing w:after="0" w:line="240" w:lineRule="auto"/>
-        <w:ind w:left="1068"/>
-      </w:pPr>
-      <w:r>
-        <w:t>Se verifica que la aplicación notifica al técnico que ha habido un error interno.</w:t>
-      </w:r>
-    </w:p>
-    <w:p/>
-    <w:p>
-      <w:r>
-        <w:t>Prueba 06. Conexión de red no disponible:</w:t>
-      </w:r>
-    </w:p>
-    <w:p>
-      <w:pPr>
-        <w:pStyle w:val="Prrafodelista"/>
-        <w:numPr>
-          <w:ilvl w:val="0"/>
-          <w:numId w:val="8"/>
-        </w:numPr>
-        <w:tabs>
-          <w:tab w:val="clear" w:pos="720"/>
-        </w:tabs>
-        <w:autoSpaceDE w:val="0"/>
-        <w:autoSpaceDN w:val="0"/>
-        <w:adjustRightInd w:val="0"/>
-        <w:spacing w:after="0" w:line="240" w:lineRule="auto"/>
-        <w:ind w:left="1068"/>
-      </w:pPr>
-      <w:r>
-        <w:t>El técnico selecciona una red de la lista de redes principal.</w:t>
-      </w:r>
-    </w:p>
-    <w:p>
-      <w:pPr>
-        <w:pStyle w:val="Prrafodelista"/>
-        <w:numPr>
-          <w:ilvl w:val="0"/>
-          <w:numId w:val="8"/>
-        </w:numPr>
-        <w:tabs>
-          <w:tab w:val="clear" w:pos="720"/>
-        </w:tabs>
-        <w:autoSpaceDE w:val="0"/>
-        <w:autoSpaceDN w:val="0"/>
-        <w:adjustRightInd w:val="0"/>
-        <w:spacing w:after="0" w:line="240" w:lineRule="auto"/>
-        <w:ind w:left="1068"/>
-      </w:pPr>
-      <w:r>
-        <w:t>La aplicación detecta que el dispositivo del técnico no dispone de conexión a la red.</w:t>
-      </w:r>
-    </w:p>
-    <w:p>
-      <w:pPr>
-        <w:pStyle w:val="Prrafodelista"/>
-        <w:numPr>
-          <w:ilvl w:val="0"/>
-          <w:numId w:val="8"/>
-        </w:numPr>
-        <w:tabs>
-          <w:tab w:val="clear" w:pos="720"/>
-        </w:tabs>
-        <w:autoSpaceDE w:val="0"/>
-        <w:autoSpaceDN w:val="0"/>
-        <w:adjustRightInd w:val="0"/>
-        <w:spacing w:after="0" w:line="240" w:lineRule="auto"/>
-        <w:ind w:left="1068"/>
-      </w:pPr>
-      <w:r>
-        <w:t xml:space="preserve">Se verifica que la aplicación notifica al técnico </w:t>
-      </w:r>
-      <w:r>
-        <w:t xml:space="preserve">que </w:t>
-      </w:r>
-      <w:r>
-        <w:t>el dispositivo no dispone de conexión a internet</w:t>
-      </w:r>
-      <w:r>
-        <w:t>.</w:t>
+        <w:spacing w:after="120" w:line="240" w:lineRule="auto"/>
+        <w:jc w:val="both"/>
+        <w:rPr>
+          <w:rFonts w:eastAsiaTheme="minorHAnsi" w:cs="Calibri"/>
+        </w:rPr>
+      </w:pPr>
+      <w:r>
+        <w:rPr>
+          <w:rFonts w:eastAsiaTheme="minorHAnsi" w:cs="Calibri"/>
+          <w:b/>
+          <w:bCs/>
+          <w:u w:val="single"/>
+        </w:rPr>
+        <w:lastRenderedPageBreak/>
+        <w:t xml:space="preserve">PRUEBAS DE </w:t>
+      </w:r>
+      <w:r>
+        <w:rPr>
+          <w:rFonts w:eastAsiaTheme="minorHAnsi" w:cs="Calibri"/>
+          <w:b/>
+          <w:bCs/>
+          <w:u w:val="single"/>
+        </w:rPr>
+        <w:t>INTERFAZ</w:t>
       </w:r>
     </w:p>
     <w:p>
@@ -940,1512 +910,10 @@
           <w:bCs/>
           <w:u w:val="single"/>
         </w:rPr>
-        <w:t xml:space="preserve">PRUEBAS DE </w:t>
-      </w:r>
-      <w:r>
-        <w:rPr>
-          <w:rFonts w:eastAsiaTheme="minorHAnsi" w:cs="Calibri"/>
-          <w:b/>
-          <w:bCs/>
-          <w:u w:val="single"/>
-        </w:rPr>
-        <w:t>INTERFAZ</w:t>
-      </w:r>
-    </w:p>
-    <w:p>
-      <w:r>
-        <w:t>Prueba 00. Éxito:</w:t>
-      </w:r>
-    </w:p>
-    <w:p>
-      <w:r>
-        <w:t>Nota: Utilizando el archivo de redes networks.json</w:t>
-      </w:r>
-    </w:p>
-    <w:p>
-      <w:pPr>
-        <w:pStyle w:val="Prrafodelista"/>
-        <w:numPr>
-          <w:ilvl w:val="0"/>
-          <w:numId w:val="9"/>
-        </w:numPr>
-        <w:autoSpaceDE w:val="0"/>
-        <w:autoSpaceDN w:val="0"/>
-        <w:adjustRightInd w:val="0"/>
-      </w:pPr>
-      <w:r>
-        <w:t xml:space="preserve">Se </w:t>
-      </w:r>
-      <w:r>
-        <w:t xml:space="preserve">selecciona </w:t>
-      </w:r>
-      <w:r>
-        <w:t>la</w:t>
-      </w:r>
-      <w:r>
-        <w:t xml:space="preserve"> red </w:t>
-      </w:r>
-      <w:r>
-        <w:t>TUeBICI</w:t>
-      </w:r>
-      <w:r>
-        <w:t xml:space="preserve"> </w:t>
-      </w:r>
-      <w:r>
-        <w:t>de la lista de redes principal.</w:t>
-      </w:r>
-    </w:p>
-    <w:p>
-      <w:pPr>
-        <w:pStyle w:val="Prrafodelista"/>
-        <w:numPr>
-          <w:ilvl w:val="0"/>
-          <w:numId w:val="9"/>
-        </w:numPr>
-        <w:autoSpaceDE w:val="0"/>
-        <w:autoSpaceDN w:val="0"/>
-        <w:adjustRightInd w:val="0"/>
-      </w:pPr>
-      <w:r>
-        <w:t>La aplicación muestra el nombre de la red</w:t>
-      </w:r>
-      <w:r>
-        <w:t xml:space="preserve"> (</w:t>
-      </w:r>
-      <w:r>
-        <w:t>TUeBICI</w:t>
-      </w:r>
-      <w:r>
-        <w:t>)</w:t>
-      </w:r>
-      <w:r>
-        <w:t xml:space="preserve"> junto con su ciudad</w:t>
-      </w:r>
-      <w:r>
-        <w:t xml:space="preserve"> (Santander)</w:t>
-      </w:r>
-      <w:r>
-        <w:t xml:space="preserve"> y </w:t>
-      </w:r>
-      <w:r>
-        <w:t>que</w:t>
-      </w:r>
-      <w:r>
-        <w:t xml:space="preserve"> no</w:t>
-      </w:r>
-      <w:r>
-        <w:t xml:space="preserve"> tiene</w:t>
-      </w:r>
-      <w:r>
-        <w:t xml:space="preserve"> bicicletas eléctricas.</w:t>
-      </w:r>
-    </w:p>
-    <w:p>
-      <w:pPr>
-        <w:pStyle w:val="Prrafodelista"/>
-        <w:numPr>
-          <w:ilvl w:val="0"/>
-          <w:numId w:val="9"/>
-        </w:numPr>
-        <w:autoSpaceDE w:val="0"/>
-        <w:autoSpaceDN w:val="0"/>
-        <w:adjustRightInd w:val="0"/>
-        <w:spacing w:after="0" w:line="240" w:lineRule="auto"/>
-      </w:pPr>
-      <w:r>
-        <w:t>Se verifica que los datos mostrados de la red son correctos.</w:t>
-      </w:r>
-    </w:p>
-    <w:p>
-      <w:pPr>
-        <w:pStyle w:val="Prrafodelista"/>
-        <w:numPr>
-          <w:ilvl w:val="0"/>
-          <w:numId w:val="9"/>
-        </w:numPr>
-        <w:autoSpaceDE w:val="0"/>
-        <w:autoSpaceDN w:val="0"/>
-        <w:adjustRightInd w:val="0"/>
-      </w:pPr>
-      <w:r>
-        <w:t>La aplicación muestra las estaciones pertenecientes a la red seleccionada, con su nombre</w:t>
-      </w:r>
-      <w:r>
-        <w:t xml:space="preserve"> </w:t>
-      </w:r>
-      <w:r>
-        <w:t>y</w:t>
-      </w:r>
-      <w:r>
-        <w:t xml:space="preserve"> su</w:t>
-      </w:r>
-      <w:r>
-        <w:t xml:space="preserve"> distancia desde la posición </w:t>
-      </w:r>
-      <w:r>
-        <w:t>actual (Se asume que esa ubicación es la Facultad de Ciencias)</w:t>
-      </w:r>
-      <w:r>
-        <w:t>.</w:t>
-      </w:r>
-      <w:r>
-        <w:t xml:space="preserve"> Nombres de las estaciones que deberían salir: </w:t>
-      </w:r>
-      <w:r>
-        <w:t>Perinés</w:t>
-      </w:r>
-      <w:r>
-        <w:t xml:space="preserve">, </w:t>
-      </w:r>
-      <w:r>
-        <w:t>Estación de Gamazo (NE)</w:t>
-      </w:r>
-      <w:r>
-        <w:t xml:space="preserve">, </w:t>
-      </w:r>
-      <w:r>
-        <w:t>Plaza Pombo (NE)</w:t>
-      </w:r>
-      <w:r>
-        <w:t xml:space="preserve">, </w:t>
-      </w:r>
-      <w:r>
-        <w:t>Renfe</w:t>
-      </w:r>
-      <w:r>
-        <w:t xml:space="preserve">, </w:t>
-      </w:r>
-      <w:r>
-        <w:t>Calle Alta (NE)</w:t>
-      </w:r>
-      <w:r>
-        <w:t xml:space="preserve">, </w:t>
-      </w:r>
-      <w:r>
-        <w:t>TUS (NE)</w:t>
-      </w:r>
-      <w:r>
-        <w:t xml:space="preserve">, </w:t>
-      </w:r>
-      <w:r>
-        <w:t xml:space="preserve">Alisal </w:t>
-      </w:r>
-      <w:r>
-        <w:lastRenderedPageBreak/>
-        <w:t>(NE)</w:t>
-      </w:r>
-      <w:r>
-        <w:t xml:space="preserve">, </w:t>
-      </w:r>
-      <w:r>
-        <w:t>Sector 4 (NE)</w:t>
-      </w:r>
-      <w:r>
-        <w:t xml:space="preserve">, </w:t>
-      </w:r>
-      <w:r>
-        <w:t>Correos</w:t>
-      </w:r>
-      <w:r>
-        <w:t xml:space="preserve">, </w:t>
-      </w:r>
-      <w:r>
-        <w:t>Instituto Pereda (NE)</w:t>
-      </w:r>
-      <w:r>
-        <w:t xml:space="preserve">, </w:t>
-      </w:r>
-      <w:r>
-        <w:t>Castilla (NE)</w:t>
-      </w:r>
-      <w:r>
-        <w:t xml:space="preserve">, </w:t>
-      </w:r>
-      <w:r>
-        <w:t>Magdalena</w:t>
-      </w:r>
-      <w:r>
-        <w:t xml:space="preserve">, </w:t>
-      </w:r>
-      <w:r>
-        <w:t>Alto Miranda</w:t>
-      </w:r>
-      <w:r>
-        <w:t xml:space="preserve">, </w:t>
-      </w:r>
-      <w:r>
-        <w:t>Puertochico</w:t>
-      </w:r>
-      <w:r>
-        <w:t xml:space="preserve">, </w:t>
-      </w:r>
-      <w:r>
-        <w:t>Centro Cívico</w:t>
-      </w:r>
-      <w:r>
-        <w:t xml:space="preserve">, </w:t>
-      </w:r>
-      <w:r>
-        <w:t>Tuebici WS - Estación de Carga</w:t>
-      </w:r>
-      <w:r>
-        <w:t xml:space="preserve">, </w:t>
-      </w:r>
-      <w:r>
-        <w:t>Ernest Lluch (NE)</w:t>
-      </w:r>
-      <w:r>
-        <w:t xml:space="preserve">, </w:t>
-      </w:r>
-      <w:r>
-        <w:t>Valdecilla</w:t>
-      </w:r>
-      <w:r>
-        <w:t xml:space="preserve">, </w:t>
-      </w:r>
-      <w:r>
-        <w:t>Intercambiador Sardinero</w:t>
-      </w:r>
-      <w:r>
-        <w:t xml:space="preserve">, </w:t>
-      </w:r>
-      <w:r>
-        <w:t>Universidad de Cantabria</w:t>
-      </w:r>
-      <w:r>
-        <w:t xml:space="preserve">, </w:t>
-      </w:r>
-      <w:r>
-        <w:t>Universidad Rectorado (NE)</w:t>
-      </w:r>
-      <w:r>
-        <w:t xml:space="preserve">, </w:t>
-      </w:r>
-      <w:r>
-        <w:t>Ayuntamiento (NE)</w:t>
-      </w:r>
-      <w:r>
-        <w:t xml:space="preserve">, </w:t>
-      </w:r>
-      <w:r>
-        <w:t>De los osos (NE)</w:t>
-      </w:r>
-      <w:r>
-        <w:t xml:space="preserve">, </w:t>
-      </w:r>
-      <w:r>
-        <w:t>Complejo Deportivo  Ruth Beitia</w:t>
-      </w:r>
-      <w:r>
-        <w:t xml:space="preserve">, </w:t>
-      </w:r>
-      <w:r>
-        <w:t>Plaza Manuel Llano</w:t>
-      </w:r>
-      <w:r>
-        <w:t xml:space="preserve">, </w:t>
-      </w:r>
-      <w:r>
-        <w:t xml:space="preserve">Dávila </w:t>
-      </w:r>
-      <w:r>
-        <w:t>–</w:t>
-      </w:r>
-      <w:r>
-        <w:t xml:space="preserve"> Polio</w:t>
-      </w:r>
-      <w:r>
-        <w:t xml:space="preserve">, </w:t>
-      </w:r>
-      <w:r>
-        <w:t>Sector 3 (NE)</w:t>
-      </w:r>
-      <w:r>
-        <w:t xml:space="preserve">, </w:t>
-      </w:r>
-      <w:r>
-        <w:t>San Román Corbán (NE)</w:t>
-      </w:r>
-      <w:r>
-        <w:t xml:space="preserve">, </w:t>
-      </w:r>
-      <w:r>
-        <w:t>Tabacalera/Varadero</w:t>
-      </w:r>
-      <w:r>
-        <w:t xml:space="preserve">, </w:t>
-      </w:r>
-      <w:r>
-        <w:t>Guevara (NE)</w:t>
-      </w:r>
-      <w:r>
-        <w:t xml:space="preserve">, </w:t>
-      </w:r>
-      <w:r>
-        <w:t xml:space="preserve">Valdenoja </w:t>
-      </w:r>
-      <w:r>
-        <w:t xml:space="preserve">, </w:t>
-      </w:r>
-      <w:r>
-        <w:t>Castilla Hermida</w:t>
-      </w:r>
-      <w:r>
-        <w:t xml:space="preserve">, </w:t>
-      </w:r>
-      <w:r>
-        <w:t>Plaza de Italia</w:t>
-      </w:r>
-      <w:r>
-        <w:t xml:space="preserve">, </w:t>
-      </w:r>
-      <w:r>
-        <w:t>Parque Llamas</w:t>
-      </w:r>
-      <w:r>
-        <w:t xml:space="preserve">, </w:t>
-      </w:r>
-      <w:r>
-        <w:t>Miguel Unamuno (NE)</w:t>
-      </w:r>
-      <w:r>
-        <w:t xml:space="preserve">, </w:t>
-      </w:r>
-      <w:r>
-        <w:t>Ernest Lluch II (NE)</w:t>
-      </w:r>
-      <w:r>
-        <w:t xml:space="preserve">, </w:t>
-      </w:r>
-      <w:r>
-        <w:t>Valdenoja 2 (NE)</w:t>
-      </w:r>
-      <w:r>
-        <w:t xml:space="preserve">, </w:t>
-      </w:r>
-      <w:r>
-        <w:t>PTCAN 1</w:t>
-      </w:r>
-      <w:r>
-        <w:t>, Monte, Montaña 2, Nueva Montaña, Tetuan.</w:t>
-      </w:r>
-    </w:p>
-    <w:p>
-      <w:pPr>
-        <w:pStyle w:val="Prrafodelista"/>
-        <w:numPr>
-          <w:ilvl w:val="0"/>
-          <w:numId w:val="9"/>
-        </w:numPr>
-        <w:autoSpaceDE w:val="0"/>
-        <w:autoSpaceDN w:val="0"/>
-        <w:adjustRightInd w:val="0"/>
-        <w:spacing w:after="0" w:line="240" w:lineRule="auto"/>
-      </w:pPr>
-      <w:r>
-        <w:t>Se verifica que los datos mostrados de cada estación son correctos.</w:t>
+        <w:t>MÉTODOS SUSCEPTIBLES DE PRUEBAS UNITARIAS/PRUEBAS DE INTEGRACIÓN</w:t>
       </w:r>
     </w:p>
     <w:p/>
-    <w:p>
-      <w:r>
-        <w:t>Prueba 01. Red sin estaciones:</w:t>
-      </w:r>
-    </w:p>
-    <w:p>
-      <w:r>
-        <w:t>Nota: Añadimos una red al archivo de redes que no disponga de</w:t>
-      </w:r>
-      <w:r>
-        <w:t xml:space="preserve"> estaciones, llamada BiciSinEstaciones, con ciudad en Santander</w:t>
-      </w:r>
-      <w:r>
-        <w:t>.</w:t>
-      </w:r>
-    </w:p>
-    <w:p>
-      <w:pPr>
-        <w:pStyle w:val="Prrafodelista"/>
-        <w:numPr>
-          <w:ilvl w:val="0"/>
-          <w:numId w:val="10"/>
-        </w:numPr>
-        <w:autoSpaceDE w:val="0"/>
-        <w:autoSpaceDN w:val="0"/>
-        <w:adjustRightInd w:val="0"/>
-        <w:spacing w:after="0" w:line="240" w:lineRule="auto"/>
-      </w:pPr>
-      <w:r>
-        <w:t>Se</w:t>
-      </w:r>
-      <w:r>
-        <w:t xml:space="preserve"> selecciona </w:t>
-      </w:r>
-      <w:r>
-        <w:t xml:space="preserve">la </w:t>
-      </w:r>
-      <w:r>
-        <w:t>red</w:t>
-      </w:r>
-      <w:r>
-        <w:t xml:space="preserve"> BiciSinEstaciones</w:t>
-      </w:r>
-      <w:r>
-        <w:t xml:space="preserve"> de la lista de redes principal.</w:t>
-      </w:r>
-    </w:p>
-    <w:p>
-      <w:pPr>
-        <w:pStyle w:val="Prrafodelista"/>
-        <w:numPr>
-          <w:ilvl w:val="0"/>
-          <w:numId w:val="10"/>
-        </w:numPr>
-        <w:autoSpaceDE w:val="0"/>
-        <w:autoSpaceDN w:val="0"/>
-        <w:adjustRightInd w:val="0"/>
-        <w:spacing w:after="0" w:line="240" w:lineRule="auto"/>
-      </w:pPr>
-      <w:r>
-        <w:t xml:space="preserve">La aplicación muestra el nombre de la red junto con su ciudad y </w:t>
-      </w:r>
-      <w:r>
-        <w:t>que</w:t>
-      </w:r>
-      <w:r>
-        <w:t xml:space="preserve"> no</w:t>
-      </w:r>
-      <w:r>
-        <w:t xml:space="preserve"> tiene</w:t>
-      </w:r>
-      <w:r>
-        <w:t xml:space="preserve"> bicicletas eléctricas.</w:t>
-      </w:r>
-    </w:p>
-    <w:p>
-      <w:pPr>
-        <w:pStyle w:val="Prrafodelista"/>
-        <w:numPr>
-          <w:ilvl w:val="0"/>
-          <w:numId w:val="10"/>
-        </w:numPr>
-        <w:autoSpaceDE w:val="0"/>
-        <w:autoSpaceDN w:val="0"/>
-        <w:adjustRightInd w:val="0"/>
-        <w:spacing w:after="0" w:line="240" w:lineRule="auto"/>
-      </w:pPr>
-      <w:r>
-        <w:t>Se verifica que los datos mostrados de la red son correctos.</w:t>
-      </w:r>
-    </w:p>
-    <w:p>
-      <w:pPr>
-        <w:pStyle w:val="Prrafodelista"/>
-        <w:numPr>
-          <w:ilvl w:val="0"/>
-          <w:numId w:val="10"/>
-        </w:numPr>
-        <w:autoSpaceDE w:val="0"/>
-        <w:autoSpaceDN w:val="0"/>
-        <w:adjustRightInd w:val="0"/>
-        <w:spacing w:after="0" w:line="240" w:lineRule="auto"/>
-      </w:pPr>
-      <w:r>
-        <w:t>La aplicación detecta que la red seleccionada no cuenta con estaciones.</w:t>
-      </w:r>
-    </w:p>
-    <w:p>
-      <w:pPr>
-        <w:pStyle w:val="Prrafodelista"/>
-        <w:numPr>
-          <w:ilvl w:val="0"/>
-          <w:numId w:val="10"/>
-        </w:numPr>
-        <w:autoSpaceDE w:val="0"/>
-        <w:autoSpaceDN w:val="0"/>
-        <w:adjustRightInd w:val="0"/>
-        <w:spacing w:after="0" w:line="240" w:lineRule="auto"/>
-      </w:pPr>
-      <w:r>
-        <w:t>Se verifica que la aplicación notifica que la red seleccionada no cuenta con estaciones.</w:t>
-      </w:r>
-    </w:p>
-    <w:p/>
-    <w:p>
-      <w:r>
-        <w:t>Prueba 02. Datos ausentes:</w:t>
-      </w:r>
-    </w:p>
-    <w:p>
-      <w:r>
-        <w:t>Nota: Esto quiere decir que alguno de los datos de la red o de las estaciones no está disponible en el servicio.</w:t>
-      </w:r>
-      <w:r>
-        <w:t xml:space="preserve"> Añadimos al archivo de redes una red sin localización llamada RedSinCiudad</w:t>
-      </w:r>
-      <w:r>
-        <w:t>, con una estación, EstaciónSinCiudad, con su localización vacía.</w:t>
-      </w:r>
-    </w:p>
-    <w:p>
-      <w:pPr>
-        <w:pStyle w:val="Prrafodelista"/>
-        <w:numPr>
-          <w:ilvl w:val="0"/>
-          <w:numId w:val="11"/>
-        </w:numPr>
-        <w:autoSpaceDE w:val="0"/>
-        <w:autoSpaceDN w:val="0"/>
-        <w:adjustRightInd w:val="0"/>
-        <w:spacing w:after="0" w:line="240" w:lineRule="auto"/>
-      </w:pPr>
-      <w:r>
-        <w:t>Se</w:t>
-      </w:r>
-      <w:r>
-        <w:t xml:space="preserve"> selecciona </w:t>
-      </w:r>
-      <w:r>
-        <w:t>la red RedSinCiudad</w:t>
-      </w:r>
-      <w:r>
-        <w:t xml:space="preserve"> de la lista de redes principal.</w:t>
-      </w:r>
-    </w:p>
-    <w:p>
-      <w:pPr>
-        <w:pStyle w:val="Prrafodelista"/>
-        <w:numPr>
-          <w:ilvl w:val="0"/>
-          <w:numId w:val="11"/>
-        </w:numPr>
-        <w:autoSpaceDE w:val="0"/>
-        <w:autoSpaceDN w:val="0"/>
-        <w:adjustRightInd w:val="0"/>
-        <w:spacing w:after="0" w:line="240" w:lineRule="auto"/>
-      </w:pPr>
-      <w:r>
-        <w:t>La aplicación detecta que hay datos de la red ausentes.</w:t>
-      </w:r>
-    </w:p>
-    <w:p>
-      <w:pPr>
-        <w:pStyle w:val="Prrafodelista"/>
-        <w:numPr>
-          <w:ilvl w:val="0"/>
-          <w:numId w:val="11"/>
-        </w:numPr>
-        <w:autoSpaceDE w:val="0"/>
-        <w:autoSpaceDN w:val="0"/>
-        <w:adjustRightInd w:val="0"/>
-        <w:spacing w:after="0" w:line="240" w:lineRule="auto"/>
-      </w:pPr>
-      <w:r>
-        <w:t>La aplicación muestra los datos disponibles de la red</w:t>
-      </w:r>
-      <w:r>
-        <w:t>, en este caso su nombre y que no tiene bicis eléctricas</w:t>
-      </w:r>
-      <w:r>
-        <w:t>.</w:t>
-      </w:r>
-    </w:p>
-    <w:p>
-      <w:pPr>
-        <w:pStyle w:val="Prrafodelista"/>
-        <w:numPr>
-          <w:ilvl w:val="0"/>
-          <w:numId w:val="11"/>
-        </w:numPr>
-        <w:autoSpaceDE w:val="0"/>
-        <w:autoSpaceDN w:val="0"/>
-        <w:adjustRightInd w:val="0"/>
-        <w:spacing w:after="0" w:line="240" w:lineRule="auto"/>
-      </w:pPr>
-      <w:r>
-        <w:t>Se verifica que los datos mostrados de la red son correctos.</w:t>
-      </w:r>
-    </w:p>
-    <w:p>
-      <w:pPr>
-        <w:pStyle w:val="Prrafodelista"/>
-        <w:numPr>
-          <w:ilvl w:val="0"/>
-          <w:numId w:val="11"/>
-        </w:numPr>
-        <w:autoSpaceDE w:val="0"/>
-        <w:autoSpaceDN w:val="0"/>
-        <w:adjustRightInd w:val="0"/>
-        <w:spacing w:after="0" w:line="240" w:lineRule="auto"/>
-      </w:pPr>
-      <w:r>
-        <w:t xml:space="preserve">Se verifica </w:t>
-      </w:r>
-      <w:r>
-        <w:t>que,</w:t>
-      </w:r>
-      <w:r>
-        <w:t xml:space="preserve"> para </w:t>
-      </w:r>
-      <w:r>
-        <w:t>la ciudad, al no estar disponible</w:t>
-      </w:r>
-      <w:r>
-        <w:t xml:space="preserve"> se muestra un guion (indicando que el dato no está disponible).</w:t>
-      </w:r>
-    </w:p>
-    <w:p>
-      <w:pPr>
-        <w:pStyle w:val="Prrafodelista"/>
-        <w:numPr>
-          <w:ilvl w:val="0"/>
-          <w:numId w:val="11"/>
-        </w:numPr>
-        <w:autoSpaceDE w:val="0"/>
-        <w:autoSpaceDN w:val="0"/>
-        <w:adjustRightInd w:val="0"/>
-        <w:spacing w:after="0" w:line="240" w:lineRule="auto"/>
-      </w:pPr>
-      <w:r>
-        <w:t xml:space="preserve">La aplicación detecta que hay datos </w:t>
-      </w:r>
-      <w:r>
-        <w:t>de la</w:t>
-      </w:r>
-      <w:r>
-        <w:t xml:space="preserve"> estación</w:t>
-      </w:r>
-      <w:r>
-        <w:t xml:space="preserve"> EstaciónSinCIudad</w:t>
-      </w:r>
-      <w:r>
-        <w:t xml:space="preserve"> ausentes.</w:t>
-      </w:r>
-    </w:p>
-    <w:p>
-      <w:pPr>
-        <w:pStyle w:val="Prrafodelista"/>
-        <w:numPr>
-          <w:ilvl w:val="0"/>
-          <w:numId w:val="11"/>
-        </w:numPr>
-        <w:autoSpaceDE w:val="0"/>
-        <w:autoSpaceDN w:val="0"/>
-        <w:adjustRightInd w:val="0"/>
-        <w:spacing w:after="0" w:line="240" w:lineRule="auto"/>
-      </w:pPr>
-      <w:r>
-        <w:t>La aplicación muestra la</w:t>
-      </w:r>
-      <w:r>
-        <w:t xml:space="preserve">s </w:t>
-      </w:r>
-      <w:r>
-        <w:t>estaciones pertenecientes a la red seleccionada, con sus datos disponibles</w:t>
-      </w:r>
-      <w:r>
-        <w:t>, en este caso solo la estación EstaciónSinCiudad</w:t>
-      </w:r>
-      <w:r>
-        <w:t>.</w:t>
-      </w:r>
-    </w:p>
-    <w:p>
-      <w:pPr>
-        <w:pStyle w:val="Prrafodelista"/>
-        <w:numPr>
-          <w:ilvl w:val="0"/>
-          <w:numId w:val="11"/>
-        </w:numPr>
-        <w:autoSpaceDE w:val="0"/>
-        <w:autoSpaceDN w:val="0"/>
-        <w:adjustRightInd w:val="0"/>
-        <w:spacing w:after="0" w:line="240" w:lineRule="auto"/>
-      </w:pPr>
-      <w:r>
-        <w:t>Se verifica que los datos mostrados de cada estación son correctos.</w:t>
-      </w:r>
-    </w:p>
-    <w:p>
-      <w:pPr>
-        <w:pStyle w:val="Prrafodelista"/>
-        <w:numPr>
-          <w:ilvl w:val="0"/>
-          <w:numId w:val="11"/>
-        </w:numPr>
-        <w:autoSpaceDE w:val="0"/>
-        <w:autoSpaceDN w:val="0"/>
-        <w:adjustRightInd w:val="0"/>
-        <w:spacing w:after="0" w:line="240" w:lineRule="auto"/>
-      </w:pPr>
-      <w:r>
-        <w:t xml:space="preserve">Se verifica que para los datos no disponibles de </w:t>
-      </w:r>
-      <w:r>
-        <w:t>la</w:t>
-      </w:r>
-      <w:r>
-        <w:t xml:space="preserve"> estación se muestra un guion (indicando que el dato no está disponible)</w:t>
-      </w:r>
-      <w:r>
-        <w:t>, en este caso la distancia a la ubicación actual</w:t>
-      </w:r>
-      <w:r>
-        <w:t>.</w:t>
-      </w:r>
-    </w:p>
-    <w:p/>
-    <w:p>
-      <w:r>
-        <w:t>Prueba 03. Geolocalización no disponible:</w:t>
-      </w:r>
-    </w:p>
-    <w:p>
-      <w:r>
-        <w:lastRenderedPageBreak/>
-        <w:t>Nota: Utilizando el archivo de redes networks.json</w:t>
-      </w:r>
-      <w:r>
-        <w:t>, desactivamos el servicio GPS del dispositivo donde se realiza la prueba</w:t>
-      </w:r>
-    </w:p>
-    <w:p>
-      <w:pPr>
-        <w:pStyle w:val="Prrafodelista"/>
-        <w:numPr>
-          <w:ilvl w:val="0"/>
-          <w:numId w:val="12"/>
-        </w:numPr>
-        <w:autoSpaceDE w:val="0"/>
-        <w:autoSpaceDN w:val="0"/>
-        <w:adjustRightInd w:val="0"/>
-        <w:spacing w:after="0" w:line="240" w:lineRule="auto"/>
-      </w:pPr>
-      <w:r>
-        <w:t xml:space="preserve">Se </w:t>
-      </w:r>
-      <w:r>
-        <w:t xml:space="preserve">selecciona </w:t>
-      </w:r>
-      <w:r>
-        <w:t>la</w:t>
-      </w:r>
-      <w:r>
-        <w:t xml:space="preserve"> red </w:t>
-      </w:r>
-      <w:r>
-        <w:t>TUeBICI</w:t>
-      </w:r>
-      <w:r>
-        <w:t xml:space="preserve"> </w:t>
-      </w:r>
-      <w:r>
-        <w:t>de la lista de redes principal.</w:t>
-      </w:r>
-    </w:p>
-    <w:p>
-      <w:pPr>
-        <w:pStyle w:val="Prrafodelista"/>
-        <w:numPr>
-          <w:ilvl w:val="0"/>
-          <w:numId w:val="12"/>
-        </w:numPr>
-        <w:autoSpaceDE w:val="0"/>
-        <w:autoSpaceDN w:val="0"/>
-        <w:adjustRightInd w:val="0"/>
-        <w:spacing w:after="0" w:line="240" w:lineRule="auto"/>
-      </w:pPr>
-      <w:r>
-        <w:t xml:space="preserve">La aplicación muestra el nombre de la red junto con su ciudad y </w:t>
-      </w:r>
-      <w:r>
-        <w:t>que</w:t>
-      </w:r>
-      <w:r>
-        <w:t xml:space="preserve"> no</w:t>
-      </w:r>
-      <w:r>
-        <w:t xml:space="preserve"> tiene</w:t>
-      </w:r>
-      <w:r>
-        <w:t xml:space="preserve"> bicicletas eléctricas.</w:t>
-      </w:r>
-    </w:p>
-    <w:p>
-      <w:pPr>
-        <w:pStyle w:val="Prrafodelista"/>
-        <w:numPr>
-          <w:ilvl w:val="0"/>
-          <w:numId w:val="12"/>
-        </w:numPr>
-        <w:autoSpaceDE w:val="0"/>
-        <w:autoSpaceDN w:val="0"/>
-        <w:adjustRightInd w:val="0"/>
-        <w:spacing w:after="0" w:line="240" w:lineRule="auto"/>
-      </w:pPr>
-      <w:r>
-        <w:t>Se verifica que los datos mostrados de la red son correctos.</w:t>
-      </w:r>
-    </w:p>
-    <w:p>
-      <w:pPr>
-        <w:pStyle w:val="Prrafodelista"/>
-        <w:numPr>
-          <w:ilvl w:val="0"/>
-          <w:numId w:val="12"/>
-        </w:numPr>
-        <w:autoSpaceDE w:val="0"/>
-        <w:autoSpaceDN w:val="0"/>
-        <w:adjustRightInd w:val="0"/>
-        <w:spacing w:after="0" w:line="240" w:lineRule="auto"/>
-      </w:pPr>
-      <w:r>
-        <w:t>La aplicación detecta que la geolocalización del dispositivo del técnico está desactivada.</w:t>
-      </w:r>
-    </w:p>
-    <w:p>
-      <w:pPr>
-        <w:pStyle w:val="Prrafodelista"/>
-        <w:numPr>
-          <w:ilvl w:val="0"/>
-          <w:numId w:val="12"/>
-        </w:numPr>
-        <w:autoSpaceDE w:val="0"/>
-        <w:autoSpaceDN w:val="0"/>
-        <w:adjustRightInd w:val="0"/>
-        <w:spacing w:after="0" w:line="240" w:lineRule="auto"/>
-      </w:pPr>
-      <w:r>
-        <w:t>La aplicación muestra las estaciones pertenecientes a la red seleccionada, con su nombre.</w:t>
-      </w:r>
-      <w:r>
-        <w:t xml:space="preserve"> Nombres de las estaciones que deberían salir: </w:t>
-      </w:r>
-      <w:r>
-        <w:t>Perinés</w:t>
-      </w:r>
-      <w:r>
-        <w:t xml:space="preserve">, </w:t>
-      </w:r>
-      <w:r>
-        <w:t>Estación de Gamazo (NE)</w:t>
-      </w:r>
-      <w:r>
-        <w:t xml:space="preserve">, </w:t>
-      </w:r>
-      <w:r>
-        <w:t>Plaza Pombo (NE)</w:t>
-      </w:r>
-      <w:r>
-        <w:t xml:space="preserve">, </w:t>
-      </w:r>
-      <w:r>
-        <w:t>Renfe</w:t>
-      </w:r>
-      <w:r>
-        <w:t xml:space="preserve">, </w:t>
-      </w:r>
-      <w:r>
-        <w:t>Calle Alta (NE)</w:t>
-      </w:r>
-      <w:r>
-        <w:t xml:space="preserve">, </w:t>
-      </w:r>
-      <w:r>
-        <w:t>TUS (NE)</w:t>
-      </w:r>
-      <w:r>
-        <w:t xml:space="preserve">, </w:t>
-      </w:r>
-      <w:r>
-        <w:t>Alisal (NE)</w:t>
-      </w:r>
-      <w:r>
-        <w:t xml:space="preserve">, </w:t>
-      </w:r>
-      <w:r>
-        <w:t>Sector 4 (NE)</w:t>
-      </w:r>
-      <w:r>
-        <w:t xml:space="preserve">, </w:t>
-      </w:r>
-      <w:r>
-        <w:t>Correos</w:t>
-      </w:r>
-      <w:r>
-        <w:t xml:space="preserve">, </w:t>
-      </w:r>
-      <w:r>
-        <w:t>Instituto Pereda (NE)</w:t>
-      </w:r>
-      <w:r>
-        <w:t xml:space="preserve">, </w:t>
-      </w:r>
-      <w:r>
-        <w:t>Castilla (NE)</w:t>
-      </w:r>
-      <w:r>
-        <w:t xml:space="preserve">, </w:t>
-      </w:r>
-      <w:r>
-        <w:t>Magdalena</w:t>
-      </w:r>
-      <w:r>
-        <w:t xml:space="preserve">, </w:t>
-      </w:r>
-      <w:r>
-        <w:t>Alto Miranda</w:t>
-      </w:r>
-      <w:r>
-        <w:t xml:space="preserve">, </w:t>
-      </w:r>
-      <w:r>
-        <w:t>Puertochico</w:t>
-      </w:r>
-      <w:r>
-        <w:t xml:space="preserve">, </w:t>
-      </w:r>
-      <w:r>
-        <w:t>Centro Cívico</w:t>
-      </w:r>
-      <w:r>
-        <w:t xml:space="preserve">, </w:t>
-      </w:r>
-      <w:r>
-        <w:t>Tuebici WS - Estación de Carga</w:t>
-      </w:r>
-      <w:r>
-        <w:t xml:space="preserve">, </w:t>
-      </w:r>
-      <w:r>
-        <w:t>Ernest Lluch (NE)</w:t>
-      </w:r>
-      <w:r>
-        <w:t xml:space="preserve">, </w:t>
-      </w:r>
-      <w:r>
-        <w:t>Valdecilla</w:t>
-      </w:r>
-      <w:r>
-        <w:t xml:space="preserve">, </w:t>
-      </w:r>
-      <w:r>
-        <w:t>Intercambiador Sardinero</w:t>
-      </w:r>
-      <w:r>
-        <w:t xml:space="preserve">, </w:t>
-      </w:r>
-      <w:r>
-        <w:t>Universidad de Cantabria</w:t>
-      </w:r>
-      <w:r>
-        <w:t xml:space="preserve">, </w:t>
-      </w:r>
-      <w:r>
-        <w:t>Universidad Rectorado (NE)</w:t>
-      </w:r>
-      <w:r>
-        <w:t xml:space="preserve">, </w:t>
-      </w:r>
-      <w:r>
-        <w:t>Ayuntamiento (NE)</w:t>
-      </w:r>
-      <w:r>
-        <w:t xml:space="preserve">, </w:t>
-      </w:r>
-      <w:r>
-        <w:t>De los osos (NE)</w:t>
-      </w:r>
-      <w:r>
-        <w:t xml:space="preserve">, </w:t>
-      </w:r>
-      <w:r>
-        <w:t>Complejo Deportivo  Ruth Beitia</w:t>
-      </w:r>
-      <w:r>
-        <w:t xml:space="preserve">, </w:t>
-      </w:r>
-      <w:r>
-        <w:t>Plaza Manuel Llano</w:t>
-      </w:r>
-      <w:r>
-        <w:t xml:space="preserve">, </w:t>
-      </w:r>
-      <w:r>
-        <w:t xml:space="preserve">Dávila </w:t>
-      </w:r>
-      <w:r>
-        <w:t>–</w:t>
-      </w:r>
-      <w:r>
-        <w:t xml:space="preserve"> Polio</w:t>
-      </w:r>
-      <w:r>
-        <w:t xml:space="preserve">, </w:t>
-      </w:r>
-      <w:r>
-        <w:t>Sector 3 (NE)</w:t>
-      </w:r>
-      <w:r>
-        <w:t xml:space="preserve">, </w:t>
-      </w:r>
-      <w:r>
-        <w:t>San Román Corbán (NE)</w:t>
-      </w:r>
-      <w:r>
-        <w:t xml:space="preserve">, </w:t>
-      </w:r>
-      <w:r>
-        <w:t>Tabacalera/Varadero</w:t>
-      </w:r>
-      <w:r>
-        <w:t xml:space="preserve">, </w:t>
-      </w:r>
-      <w:r>
-        <w:t>Guevara (NE)</w:t>
-      </w:r>
-      <w:r>
-        <w:t xml:space="preserve">, </w:t>
-      </w:r>
-      <w:r>
-        <w:t xml:space="preserve">Valdenoja </w:t>
-      </w:r>
-      <w:r>
-        <w:t xml:space="preserve">, </w:t>
-      </w:r>
-      <w:r>
-        <w:t>Castilla Hermida</w:t>
-      </w:r>
-      <w:r>
-        <w:t xml:space="preserve">, </w:t>
-      </w:r>
-      <w:r>
-        <w:t>Plaza de Italia</w:t>
-      </w:r>
-      <w:r>
-        <w:t xml:space="preserve">, </w:t>
-      </w:r>
-      <w:r>
-        <w:t>Parque Llamas</w:t>
-      </w:r>
-      <w:r>
-        <w:t xml:space="preserve">, </w:t>
-      </w:r>
-      <w:r>
-        <w:t>Miguel Unamuno (NE)</w:t>
-      </w:r>
-      <w:r>
-        <w:t xml:space="preserve">, </w:t>
-      </w:r>
-      <w:r>
-        <w:t>Ernest Lluch II (NE)</w:t>
-      </w:r>
-      <w:r>
-        <w:t xml:space="preserve">, </w:t>
-      </w:r>
-      <w:r>
-        <w:t>Valdenoja 2 (NE)</w:t>
-      </w:r>
-      <w:r>
-        <w:t xml:space="preserve">, </w:t>
-      </w:r>
-      <w:r>
-        <w:t>PTCAN 1</w:t>
-      </w:r>
-      <w:r>
-        <w:t>, Monte, Montaña 2, Nueva Montaña, Tetuan.</w:t>
-      </w:r>
-    </w:p>
-    <w:p>
-      <w:pPr>
-        <w:pStyle w:val="Prrafodelista"/>
-        <w:numPr>
-          <w:ilvl w:val="0"/>
-          <w:numId w:val="12"/>
-        </w:numPr>
-        <w:autoSpaceDE w:val="0"/>
-        <w:autoSpaceDN w:val="0"/>
-        <w:adjustRightInd w:val="0"/>
-        <w:spacing w:after="0" w:line="240" w:lineRule="auto"/>
-      </w:pPr>
-      <w:r>
-        <w:t>Se verifica que los datos mostrados de cada estación son correctos.</w:t>
-      </w:r>
-    </w:p>
-    <w:p>
-      <w:pPr>
-        <w:pStyle w:val="Prrafodelista"/>
-        <w:numPr>
-          <w:ilvl w:val="0"/>
-          <w:numId w:val="12"/>
-        </w:numPr>
-        <w:autoSpaceDE w:val="0"/>
-        <w:autoSpaceDN w:val="0"/>
-        <w:adjustRightInd w:val="0"/>
-        <w:spacing w:after="0" w:line="240" w:lineRule="auto"/>
-      </w:pPr>
-      <w:r>
-        <w:t>Se verifica que en lugar de la distancia a cada estación se muestra un guion (indicando que el dato no está disponible).</w:t>
-      </w:r>
-    </w:p>
-    <w:p>
-      <w:pPr>
-        <w:pStyle w:val="Prrafodelista"/>
-        <w:numPr>
-          <w:ilvl w:val="0"/>
-          <w:numId w:val="12"/>
-        </w:numPr>
-        <w:autoSpaceDE w:val="0"/>
-        <w:autoSpaceDN w:val="0"/>
-        <w:adjustRightInd w:val="0"/>
-        <w:spacing w:after="0" w:line="240" w:lineRule="auto"/>
-      </w:pPr>
-      <w:r>
-        <w:t>Se verifica que la aplicación notifica que la geolocalización está desactivada.</w:t>
-      </w:r>
-    </w:p>
-    <w:p/>
-    <w:p>
-      <w:r>
-        <w:t>Prueba 04. Servicio de datos no disponible:</w:t>
-      </w:r>
-    </w:p>
-    <w:p>
-      <w:r>
-        <w:t>Nota: Utilizando el archivo de redes networks.json, simulamos que el servicio no responde.</w:t>
-      </w:r>
-    </w:p>
-    <w:p>
-      <w:pPr>
-        <w:pStyle w:val="Prrafodelista"/>
-        <w:numPr>
-          <w:ilvl w:val="0"/>
-          <w:numId w:val="13"/>
-        </w:numPr>
-        <w:autoSpaceDE w:val="0"/>
-        <w:autoSpaceDN w:val="0"/>
-        <w:adjustRightInd w:val="0"/>
-        <w:spacing w:after="0" w:line="240" w:lineRule="auto"/>
-      </w:pPr>
-      <w:r>
-        <w:t xml:space="preserve">Se </w:t>
-      </w:r>
-      <w:r>
-        <w:t xml:space="preserve">selecciona </w:t>
-      </w:r>
-      <w:r>
-        <w:t>la</w:t>
-      </w:r>
-      <w:r>
-        <w:t xml:space="preserve"> red </w:t>
-      </w:r>
-      <w:r>
-        <w:t>TUeBICI</w:t>
-      </w:r>
-      <w:r>
-        <w:t xml:space="preserve"> </w:t>
-      </w:r>
-      <w:r>
-        <w:t>de la lista de redes principal.</w:t>
-      </w:r>
-    </w:p>
-    <w:p>
-      <w:pPr>
-        <w:pStyle w:val="Prrafodelista"/>
-        <w:numPr>
-          <w:ilvl w:val="0"/>
-          <w:numId w:val="13"/>
-        </w:numPr>
-        <w:autoSpaceDE w:val="0"/>
-        <w:autoSpaceDN w:val="0"/>
-        <w:adjustRightInd w:val="0"/>
-        <w:spacing w:after="0" w:line="240" w:lineRule="auto"/>
-      </w:pPr>
-      <w:r>
-        <w:t>La aplicación detecta que el servicio de datos no responde.</w:t>
-      </w:r>
-    </w:p>
-    <w:p>
-      <w:pPr>
-        <w:pStyle w:val="Prrafodelista"/>
-        <w:numPr>
-          <w:ilvl w:val="0"/>
-          <w:numId w:val="13"/>
-        </w:numPr>
-        <w:autoSpaceDE w:val="0"/>
-        <w:autoSpaceDN w:val="0"/>
-        <w:adjustRightInd w:val="0"/>
-        <w:spacing w:after="0" w:line="240" w:lineRule="auto"/>
-      </w:pPr>
-      <w:r>
-        <w:t>Se verifica que la aplicación notifica que ha habido un error interno.</w:t>
-      </w:r>
-    </w:p>
-    <w:p/>
-    <w:p>
-      <w:r>
-        <w:t>Prueba 05. Error al comunicarse con el servicio de datos:</w:t>
-      </w:r>
-    </w:p>
-    <w:p>
-      <w:r>
-        <w:t>Nota: Utilizando el archivo de redes networks.json, simulamos un error al acceder al servicio.</w:t>
-      </w:r>
-    </w:p>
-    <w:p>
-      <w:pPr>
-        <w:pStyle w:val="Prrafodelista"/>
-        <w:numPr>
-          <w:ilvl w:val="0"/>
-          <w:numId w:val="14"/>
-        </w:numPr>
-        <w:autoSpaceDE w:val="0"/>
-        <w:autoSpaceDN w:val="0"/>
-        <w:adjustRightInd w:val="0"/>
-        <w:spacing w:after="0" w:line="240" w:lineRule="auto"/>
-      </w:pPr>
-      <w:r>
-        <w:t xml:space="preserve">Se </w:t>
-      </w:r>
-      <w:r>
-        <w:t xml:space="preserve">selecciona </w:t>
-      </w:r>
-      <w:r>
-        <w:t>la</w:t>
-      </w:r>
-      <w:r>
-        <w:t xml:space="preserve"> red </w:t>
-      </w:r>
-      <w:r>
-        <w:t>TUeBICI</w:t>
-      </w:r>
-      <w:r>
-        <w:t xml:space="preserve"> </w:t>
-      </w:r>
-      <w:r>
-        <w:t>de la lista de redes principal.</w:t>
-      </w:r>
-    </w:p>
-    <w:p>
-      <w:pPr>
-        <w:pStyle w:val="Prrafodelista"/>
-        <w:numPr>
-          <w:ilvl w:val="0"/>
-          <w:numId w:val="14"/>
-        </w:numPr>
-        <w:autoSpaceDE w:val="0"/>
-        <w:autoSpaceDN w:val="0"/>
-        <w:adjustRightInd w:val="0"/>
-        <w:spacing w:after="0" w:line="240" w:lineRule="auto"/>
-      </w:pPr>
-      <w:r>
-        <w:t>La aplicación detecta que ha ocurrido un error al acceder al servicio de datos.</w:t>
-      </w:r>
-    </w:p>
-    <w:p>
-      <w:pPr>
-        <w:pStyle w:val="Prrafodelista"/>
-        <w:numPr>
-          <w:ilvl w:val="0"/>
-          <w:numId w:val="14"/>
-        </w:numPr>
-        <w:autoSpaceDE w:val="0"/>
-        <w:autoSpaceDN w:val="0"/>
-        <w:adjustRightInd w:val="0"/>
-        <w:spacing w:after="0" w:line="240" w:lineRule="auto"/>
-      </w:pPr>
-      <w:r>
-        <w:t>Se verifica que la aplicación notifica que ha habido un error interno.</w:t>
-      </w:r>
-    </w:p>
-    <w:p/>
-    <w:p>
-      <w:r>
-        <w:t>Prueba 06. Conexión de red no disponible:</w:t>
-      </w:r>
-    </w:p>
-    <w:p>
-      <w:r>
-        <w:t>Nota: Utilizando el archivo de redes networks.json, desactivamos la conexión a internet del dispositivo donde se realiza la prueba</w:t>
-      </w:r>
-    </w:p>
-    <w:p>
-      <w:pPr>
-        <w:pStyle w:val="Prrafodelista"/>
-        <w:numPr>
-          <w:ilvl w:val="0"/>
-          <w:numId w:val="15"/>
-        </w:numPr>
-        <w:autoSpaceDE w:val="0"/>
-        <w:autoSpaceDN w:val="0"/>
-        <w:adjustRightInd w:val="0"/>
-        <w:spacing w:after="0" w:line="240" w:lineRule="auto"/>
-      </w:pPr>
-      <w:r>
-        <w:t xml:space="preserve">Se </w:t>
-      </w:r>
-      <w:r>
-        <w:t xml:space="preserve">selecciona </w:t>
-      </w:r>
-      <w:r>
-        <w:t>la</w:t>
-      </w:r>
-      <w:r>
-        <w:t xml:space="preserve"> red </w:t>
-      </w:r>
-      <w:r>
-        <w:t>TUeBICI</w:t>
-      </w:r>
-      <w:r>
-        <w:t xml:space="preserve"> </w:t>
-      </w:r>
-      <w:r>
-        <w:t>de la lista de redes principal.</w:t>
-      </w:r>
-    </w:p>
-    <w:p>
-      <w:pPr>
-        <w:pStyle w:val="Prrafodelista"/>
-        <w:numPr>
-          <w:ilvl w:val="0"/>
-          <w:numId w:val="15"/>
-        </w:numPr>
-        <w:autoSpaceDE w:val="0"/>
-        <w:autoSpaceDN w:val="0"/>
-        <w:adjustRightInd w:val="0"/>
-        <w:spacing w:after="0" w:line="240" w:lineRule="auto"/>
-      </w:pPr>
-      <w:r>
-        <w:t>La aplicación detecta que el dispositivo no dispone de conexión a la red.</w:t>
-      </w:r>
-    </w:p>
-    <w:p>
-      <w:pPr>
-        <w:pStyle w:val="Prrafodelista"/>
-        <w:numPr>
-          <w:ilvl w:val="0"/>
-          <w:numId w:val="15"/>
-        </w:numPr>
-        <w:autoSpaceDE w:val="0"/>
-        <w:autoSpaceDN w:val="0"/>
-        <w:adjustRightInd w:val="0"/>
-        <w:spacing w:after="0" w:line="240" w:lineRule="auto"/>
-      </w:pPr>
-      <w:r>
-        <w:lastRenderedPageBreak/>
-        <w:t xml:space="preserve">Se verifica que la aplicación notifica que </w:t>
-      </w:r>
-      <w:r>
-        <w:t>el dispositivo no dispone de conexión a internet</w:t>
-      </w:r>
-      <w:r>
-        <w:t>.</w:t>
-      </w:r>
-    </w:p>
-    <w:p>
-      <w:pPr>
-        <w:pStyle w:val="Prrafodelista"/>
-        <w:autoSpaceDE w:val="0"/>
-        <w:autoSpaceDN w:val="0"/>
-        <w:adjustRightInd w:val="0"/>
-        <w:spacing w:after="0" w:line="240" w:lineRule="auto"/>
-        <w:ind w:left="1068"/>
-      </w:pPr>
-    </w:p>
-    <w:p>
-      <w:r>
-        <w:rPr>
-          <w:rFonts w:eastAsiaTheme="minorHAnsi" w:cs="Calibri"/>
-          <w:b/>
-          <w:bCs/>
-          <w:u w:val="single"/>
-        </w:rPr>
-        <w:t>MÉTODOS SUSCEPTIBLES DE PRUEBAS UNITARIAS/PRUEBAS DE INTEGRACIÓN</w:t>
-      </w:r>
-    </w:p>
-    <w:p>
-      <w:r>
-        <w:t>Método</w:t>
-      </w:r>
-      <w:r>
-        <w:t>s</w:t>
-      </w:r>
-      <w:r>
-        <w:t xml:space="preserve"> </w:t>
-      </w:r>
-      <w:r>
-        <w:t>getCurrentLocation()</w:t>
-      </w:r>
-      <w:r>
-        <w:t xml:space="preserve">, </w:t>
-      </w:r>
-      <w:r>
-        <w:t>init(Context context)</w:t>
-      </w:r>
-      <w:r>
-        <w:t xml:space="preserve">, </w:t>
-      </w:r>
-      <w:r>
-        <w:t>updateLocation()</w:t>
-      </w:r>
-      <w:r>
-        <w:t xml:space="preserve"> y </w:t>
-      </w:r>
-      <w:r>
-        <w:t>calcularDistanciaA(double latitud, double longitud)</w:t>
-      </w:r>
-      <w:r>
-        <w:t xml:space="preserve"> de LocationUtils, ya que toda la clase es nueva</w:t>
-      </w:r>
-      <w:r>
-        <w:t>.</w:t>
-      </w:r>
-    </w:p>
-    <w:p>
-      <w:r>
-        <w:t>Métodos isNetworkAvailable(Context context) y isLocationEnabled(Context context) de la clase Utils, al se</w:t>
-      </w:r>
-      <w:r>
-        <w:t>r nuevos.</w:t>
-      </w:r>
-    </w:p>
-    <w:p>
-      <w:r>
-        <w:t xml:space="preserve">Métodos </w:t>
-      </w:r>
-      <w:r>
-        <w:t>init(IRedDetailsContract.View view, Network network)</w:t>
-      </w:r>
-      <w:r>
-        <w:t xml:space="preserve">, </w:t>
-      </w:r>
-      <w:r>
-        <w:t>load()</w:t>
-      </w:r>
-      <w:r>
-        <w:t xml:space="preserve">, de la clase </w:t>
-      </w:r>
-      <w:r>
-        <w:t>RedDetailsPresenter</w:t>
-      </w:r>
-      <w:r>
-        <w:t xml:space="preserve"> al ser una clase nueva.</w:t>
-      </w:r>
-    </w:p>
-    <w:p>
-      <w:r>
-        <w:t>Método getView(int position, @Nullable View convertView, @NonNull ViewGroup parent) de la clase StationsArrayAdapter, al ser un</w:t>
-      </w:r>
-      <w:r>
-        <w:t>a clase nueva con ese método sobrescrito</w:t>
-      </w:r>
-    </w:p>
-    <w:p>
-      <w:pPr>
-        <w:pStyle w:val="Prrafodelista"/>
-        <w:jc w:val="both"/>
-      </w:pPr>
-    </w:p>
     <w:p>
       <w:pPr>
         <w:jc w:val="both"/>
@@ -2750,6 +1218,7 @@
           <w:bCs/>
         </w:rPr>
       </w:pPr>
+      <w:proofErr w:type="spellStart"/>
       <w:r>
         <w:rPr>
           <w:b/>
@@ -2757,17 +1226,25 @@
         </w:rPr>
         <w:t>VerEstacionesDeUnaRedExitoUITest</w:t>
       </w:r>
+      <w:proofErr w:type="spellEnd"/>
     </w:p>
     <w:p>
       <w:pPr>
         <w:jc w:val="both"/>
       </w:pPr>
       <w:r>
-        <w:lastRenderedPageBreak/>
         <w:t>No se han encontrado errores, aunque debido a este test hemos cambiado la forma en la que obteníamos la localización, antes usábamos una librería de Google, y ahora usamos una función del propio Android</w:t>
       </w:r>
       <w:r>
-        <w:t>, ya que sin ese cambio los mocks de localización no funcionaban</w:t>
+        <w:t xml:space="preserve">, ya que sin ese cambio los </w:t>
+      </w:r>
+      <w:proofErr w:type="spellStart"/>
+      <w:r>
+        <w:t>mocks</w:t>
+      </w:r>
+      <w:proofErr w:type="spellEnd"/>
+      <w:r>
+        <w:t xml:space="preserve"> de localización no funcionaban</w:t>
       </w:r>
       <w:r>
         <w:t>.</w:t>
@@ -2781,6 +1258,7 @@
           <w:bCs/>
         </w:rPr>
       </w:pPr>
+      <w:proofErr w:type="spellStart"/>
       <w:r>
         <w:rPr>
           <w:b/>
@@ -2788,6 +1266,7 @@
         </w:rPr>
         <w:t>VerEstacionesDeUnaRedSinEstacionesUITest</w:t>
       </w:r>
+      <w:proofErr w:type="spellEnd"/>
     </w:p>
     <w:p>
       <w:pPr>
@@ -2797,7 +1276,31 @@
         <w:t xml:space="preserve">No se han encontrado errores, </w:t>
       </w:r>
       <w:r>
-        <w:t>he tenido que usar un thread para una espera ya que como el expresso es muy rápido, leía el toast anterior en lugar del toast que salta cuando no hay estaciones disponibles.</w:t>
+        <w:t xml:space="preserve">he tenido que usar un thread para una espera ya que como el </w:t>
+      </w:r>
+      <w:proofErr w:type="spellStart"/>
+      <w:r>
+        <w:t>expresso</w:t>
+      </w:r>
+      <w:proofErr w:type="spellEnd"/>
+      <w:r>
+        <w:t xml:space="preserve"> es muy rápido, leía el </w:t>
+      </w:r>
+      <w:proofErr w:type="spellStart"/>
+      <w:r>
+        <w:t>toast</w:t>
+      </w:r>
+      <w:proofErr w:type="spellEnd"/>
+      <w:r>
+        <w:t xml:space="preserve"> anterior en lugar del </w:t>
+      </w:r>
+      <w:proofErr w:type="spellStart"/>
+      <w:r>
+        <w:t>toast</w:t>
+      </w:r>
+      <w:proofErr w:type="spellEnd"/>
+      <w:r>
+        <w:t xml:space="preserve"> que salta cuando no hay estaciones disponibles.</w:t>
       </w:r>
     </w:p>
     <w:p>
@@ -2808,6 +1311,7 @@
           <w:bCs/>
         </w:rPr>
       </w:pPr>
+      <w:proofErr w:type="spellStart"/>
       <w:r>
         <w:rPr>
           <w:b/>
@@ -2815,6 +1319,7 @@
         </w:rPr>
         <w:t>RedDetailsPresenterTest</w:t>
       </w:r>
+      <w:proofErr w:type="spellEnd"/>
     </w:p>
     <w:p>
       <w:pPr>
@@ -3679,6 +2184,92 @@
     </w:lvl>
   </w:abstractNum>
   <w:abstractNum w:abstractNumId="4" w15:restartNumberingAfterBreak="0">
+    <w:nsid w:val="11675F50"/>
+    <w:multiLevelType w:val="hybridMultilevel"/>
+    <w:tmpl w:val="AC748B3A"/>
+    <w:lvl w:ilvl="0" w:tplc="0409000F">
+      <w:start w:val="1"/>
+      <w:numFmt w:val="decimal"/>
+      <w:lvlText w:val="%1."/>
+      <w:lvlJc w:val="left"/>
+      <w:pPr>
+        <w:ind w:left="720" w:hanging="360"/>
+      </w:pPr>
+    </w:lvl>
+    <w:lvl w:ilvl="1" w:tplc="04090019" w:tentative="1">
+      <w:start w:val="1"/>
+      <w:numFmt w:val="lowerLetter"/>
+      <w:lvlText w:val="%2."/>
+      <w:lvlJc w:val="left"/>
+      <w:pPr>
+        <w:ind w:left="1440" w:hanging="360"/>
+      </w:pPr>
+    </w:lvl>
+    <w:lvl w:ilvl="2" w:tplc="0409001B" w:tentative="1">
+      <w:start w:val="1"/>
+      <w:numFmt w:val="lowerRoman"/>
+      <w:lvlText w:val="%3."/>
+      <w:lvlJc w:val="right"/>
+      <w:pPr>
+        <w:ind w:left="2160" w:hanging="180"/>
+      </w:pPr>
+    </w:lvl>
+    <w:lvl w:ilvl="3" w:tplc="0409000F" w:tentative="1">
+      <w:start w:val="1"/>
+      <w:numFmt w:val="decimal"/>
+      <w:lvlText w:val="%4."/>
+      <w:lvlJc w:val="left"/>
+      <w:pPr>
+        <w:ind w:left="2880" w:hanging="360"/>
+      </w:pPr>
+    </w:lvl>
+    <w:lvl w:ilvl="4" w:tplc="04090019" w:tentative="1">
+      <w:start w:val="1"/>
+      <w:numFmt w:val="lowerLetter"/>
+      <w:lvlText w:val="%5."/>
+      <w:lvlJc w:val="left"/>
+      <w:pPr>
+        <w:ind w:left="3600" w:hanging="360"/>
+      </w:pPr>
+    </w:lvl>
+    <w:lvl w:ilvl="5" w:tplc="0409001B" w:tentative="1">
+      <w:start w:val="1"/>
+      <w:numFmt w:val="lowerRoman"/>
+      <w:lvlText w:val="%6."/>
+      <w:lvlJc w:val="right"/>
+      <w:pPr>
+        <w:ind w:left="4320" w:hanging="180"/>
+      </w:pPr>
+    </w:lvl>
+    <w:lvl w:ilvl="6" w:tplc="0409000F" w:tentative="1">
+      <w:start w:val="1"/>
+      <w:numFmt w:val="decimal"/>
+      <w:lvlText w:val="%7."/>
+      <w:lvlJc w:val="left"/>
+      <w:pPr>
+        <w:ind w:left="5040" w:hanging="360"/>
+      </w:pPr>
+    </w:lvl>
+    <w:lvl w:ilvl="7" w:tplc="04090019" w:tentative="1">
+      <w:start w:val="1"/>
+      <w:numFmt w:val="lowerLetter"/>
+      <w:lvlText w:val="%8."/>
+      <w:lvlJc w:val="left"/>
+      <w:pPr>
+        <w:ind w:left="5760" w:hanging="360"/>
+      </w:pPr>
+    </w:lvl>
+    <w:lvl w:ilvl="8" w:tplc="0409001B" w:tentative="1">
+      <w:start w:val="1"/>
+      <w:numFmt w:val="lowerRoman"/>
+      <w:lvlText w:val="%9."/>
+      <w:lvlJc w:val="right"/>
+      <w:pPr>
+        <w:ind w:left="6480" w:hanging="180"/>
+      </w:pPr>
+    </w:lvl>
+  </w:abstractNum>
+  <w:abstractNum w:abstractNumId="5" w15:restartNumberingAfterBreak="0">
     <w:nsid w:val="12021798"/>
     <w:multiLevelType w:val="multilevel"/>
     <w:tmpl w:val="9C6AFD62"/>
@@ -3791,7 +2382,7 @@
       </w:pPr>
     </w:lvl>
   </w:abstractNum>
-  <w:abstractNum w:abstractNumId="5" w15:restartNumberingAfterBreak="0">
+  <w:abstractNum w:abstractNumId="6" w15:restartNumberingAfterBreak="0">
     <w:nsid w:val="1A381105"/>
     <w:multiLevelType w:val="multilevel"/>
     <w:tmpl w:val="85EC392C"/>
@@ -3904,7 +2495,93 @@
       </w:pPr>
     </w:lvl>
   </w:abstractNum>
-  <w:abstractNum w:abstractNumId="6" w15:restartNumberingAfterBreak="0">
+  <w:abstractNum w:abstractNumId="7" w15:restartNumberingAfterBreak="0">
+    <w:nsid w:val="1EED2A8D"/>
+    <w:multiLevelType w:val="hybridMultilevel"/>
+    <w:tmpl w:val="25EAF3B8"/>
+    <w:lvl w:ilvl="0" w:tplc="0409000F">
+      <w:start w:val="1"/>
+      <w:numFmt w:val="decimal"/>
+      <w:lvlText w:val="%1."/>
+      <w:lvlJc w:val="left"/>
+      <w:pPr>
+        <w:ind w:left="720" w:hanging="360"/>
+      </w:pPr>
+    </w:lvl>
+    <w:lvl w:ilvl="1" w:tplc="04090019" w:tentative="1">
+      <w:start w:val="1"/>
+      <w:numFmt w:val="lowerLetter"/>
+      <w:lvlText w:val="%2."/>
+      <w:lvlJc w:val="left"/>
+      <w:pPr>
+        <w:ind w:left="1440" w:hanging="360"/>
+      </w:pPr>
+    </w:lvl>
+    <w:lvl w:ilvl="2" w:tplc="0409001B" w:tentative="1">
+      <w:start w:val="1"/>
+      <w:numFmt w:val="lowerRoman"/>
+      <w:lvlText w:val="%3."/>
+      <w:lvlJc w:val="right"/>
+      <w:pPr>
+        <w:ind w:left="2160" w:hanging="180"/>
+      </w:pPr>
+    </w:lvl>
+    <w:lvl w:ilvl="3" w:tplc="0409000F" w:tentative="1">
+      <w:start w:val="1"/>
+      <w:numFmt w:val="decimal"/>
+      <w:lvlText w:val="%4."/>
+      <w:lvlJc w:val="left"/>
+      <w:pPr>
+        <w:ind w:left="2880" w:hanging="360"/>
+      </w:pPr>
+    </w:lvl>
+    <w:lvl w:ilvl="4" w:tplc="04090019" w:tentative="1">
+      <w:start w:val="1"/>
+      <w:numFmt w:val="lowerLetter"/>
+      <w:lvlText w:val="%5."/>
+      <w:lvlJc w:val="left"/>
+      <w:pPr>
+        <w:ind w:left="3600" w:hanging="360"/>
+      </w:pPr>
+    </w:lvl>
+    <w:lvl w:ilvl="5" w:tplc="0409001B" w:tentative="1">
+      <w:start w:val="1"/>
+      <w:numFmt w:val="lowerRoman"/>
+      <w:lvlText w:val="%6."/>
+      <w:lvlJc w:val="right"/>
+      <w:pPr>
+        <w:ind w:left="4320" w:hanging="180"/>
+      </w:pPr>
+    </w:lvl>
+    <w:lvl w:ilvl="6" w:tplc="0409000F" w:tentative="1">
+      <w:start w:val="1"/>
+      <w:numFmt w:val="decimal"/>
+      <w:lvlText w:val="%7."/>
+      <w:lvlJc w:val="left"/>
+      <w:pPr>
+        <w:ind w:left="5040" w:hanging="360"/>
+      </w:pPr>
+    </w:lvl>
+    <w:lvl w:ilvl="7" w:tplc="04090019" w:tentative="1">
+      <w:start w:val="1"/>
+      <w:numFmt w:val="lowerLetter"/>
+      <w:lvlText w:val="%8."/>
+      <w:lvlJc w:val="left"/>
+      <w:pPr>
+        <w:ind w:left="5760" w:hanging="360"/>
+      </w:pPr>
+    </w:lvl>
+    <w:lvl w:ilvl="8" w:tplc="0409001B" w:tentative="1">
+      <w:start w:val="1"/>
+      <w:numFmt w:val="lowerRoman"/>
+      <w:lvlText w:val="%9."/>
+      <w:lvlJc w:val="right"/>
+      <w:pPr>
+        <w:ind w:left="6480" w:hanging="180"/>
+      </w:pPr>
+    </w:lvl>
+  </w:abstractNum>
+  <w:abstractNum w:abstractNumId="8" w15:restartNumberingAfterBreak="0">
     <w:nsid w:val="20436DAC"/>
     <w:multiLevelType w:val="multilevel"/>
     <w:tmpl w:val="25BAA792"/>
@@ -4017,7 +2694,7 @@
       </w:pPr>
     </w:lvl>
   </w:abstractNum>
-  <w:abstractNum w:abstractNumId="7" w15:restartNumberingAfterBreak="0">
+  <w:abstractNum w:abstractNumId="9" w15:restartNumberingAfterBreak="0">
     <w:nsid w:val="32842869"/>
     <w:multiLevelType w:val="multilevel"/>
     <w:tmpl w:val="899A429C"/>
@@ -4130,7 +2807,7 @@
       </w:pPr>
     </w:lvl>
   </w:abstractNum>
-  <w:abstractNum w:abstractNumId="8" w15:restartNumberingAfterBreak="0">
+  <w:abstractNum w:abstractNumId="10" w15:restartNumberingAfterBreak="0">
     <w:nsid w:val="33114DC2"/>
     <w:multiLevelType w:val="multilevel"/>
     <w:tmpl w:val="85EC392C"/>
@@ -4243,7 +2920,7 @@
       </w:pPr>
     </w:lvl>
   </w:abstractNum>
-  <w:abstractNum w:abstractNumId="9" w15:restartNumberingAfterBreak="0">
+  <w:abstractNum w:abstractNumId="11" w15:restartNumberingAfterBreak="0">
     <w:nsid w:val="45504AC2"/>
     <w:multiLevelType w:val="multilevel"/>
     <w:tmpl w:val="67C211EA"/>
@@ -4356,7 +3033,7 @@
       </w:pPr>
     </w:lvl>
   </w:abstractNum>
-  <w:abstractNum w:abstractNumId="10" w15:restartNumberingAfterBreak="0">
+  <w:abstractNum w:abstractNumId="12" w15:restartNumberingAfterBreak="0">
     <w:nsid w:val="55A43D19"/>
     <w:multiLevelType w:val="multilevel"/>
     <w:tmpl w:val="4DAAE5EE"/>
@@ -4469,7 +3146,7 @@
       </w:pPr>
     </w:lvl>
   </w:abstractNum>
-  <w:abstractNum w:abstractNumId="11" w15:restartNumberingAfterBreak="0">
+  <w:abstractNum w:abstractNumId="13" w15:restartNumberingAfterBreak="0">
     <w:nsid w:val="5A6B73A6"/>
     <w:multiLevelType w:val="multilevel"/>
     <w:tmpl w:val="4E6E2546"/>
@@ -4582,7 +3259,7 @@
       </w:pPr>
     </w:lvl>
   </w:abstractNum>
-  <w:abstractNum w:abstractNumId="12" w15:restartNumberingAfterBreak="0">
+  <w:abstractNum w:abstractNumId="14" w15:restartNumberingAfterBreak="0">
     <w:nsid w:val="5DD50263"/>
     <w:multiLevelType w:val="multilevel"/>
     <w:tmpl w:val="4DAAE5EE"/>
@@ -4695,7 +3372,93 @@
       </w:pPr>
     </w:lvl>
   </w:abstractNum>
-  <w:abstractNum w:abstractNumId="13" w15:restartNumberingAfterBreak="0">
+  <w:abstractNum w:abstractNumId="15" w15:restartNumberingAfterBreak="0">
+    <w:nsid w:val="64DF7C0D"/>
+    <w:multiLevelType w:val="hybridMultilevel"/>
+    <w:tmpl w:val="8E28FF80"/>
+    <w:lvl w:ilvl="0" w:tplc="0409000F">
+      <w:start w:val="1"/>
+      <w:numFmt w:val="decimal"/>
+      <w:lvlText w:val="%1."/>
+      <w:lvlJc w:val="left"/>
+      <w:pPr>
+        <w:ind w:left="720" w:hanging="360"/>
+      </w:pPr>
+    </w:lvl>
+    <w:lvl w:ilvl="1" w:tplc="04090019" w:tentative="1">
+      <w:start w:val="1"/>
+      <w:numFmt w:val="lowerLetter"/>
+      <w:lvlText w:val="%2."/>
+      <w:lvlJc w:val="left"/>
+      <w:pPr>
+        <w:ind w:left="1440" w:hanging="360"/>
+      </w:pPr>
+    </w:lvl>
+    <w:lvl w:ilvl="2" w:tplc="0409001B" w:tentative="1">
+      <w:start w:val="1"/>
+      <w:numFmt w:val="lowerRoman"/>
+      <w:lvlText w:val="%3."/>
+      <w:lvlJc w:val="right"/>
+      <w:pPr>
+        <w:ind w:left="2160" w:hanging="180"/>
+      </w:pPr>
+    </w:lvl>
+    <w:lvl w:ilvl="3" w:tplc="0409000F" w:tentative="1">
+      <w:start w:val="1"/>
+      <w:numFmt w:val="decimal"/>
+      <w:lvlText w:val="%4."/>
+      <w:lvlJc w:val="left"/>
+      <w:pPr>
+        <w:ind w:left="2880" w:hanging="360"/>
+      </w:pPr>
+    </w:lvl>
+    <w:lvl w:ilvl="4" w:tplc="04090019" w:tentative="1">
+      <w:start w:val="1"/>
+      <w:numFmt w:val="lowerLetter"/>
+      <w:lvlText w:val="%5."/>
+      <w:lvlJc w:val="left"/>
+      <w:pPr>
+        <w:ind w:left="3600" w:hanging="360"/>
+      </w:pPr>
+    </w:lvl>
+    <w:lvl w:ilvl="5" w:tplc="0409001B" w:tentative="1">
+      <w:start w:val="1"/>
+      <w:numFmt w:val="lowerRoman"/>
+      <w:lvlText w:val="%6."/>
+      <w:lvlJc w:val="right"/>
+      <w:pPr>
+        <w:ind w:left="4320" w:hanging="180"/>
+      </w:pPr>
+    </w:lvl>
+    <w:lvl w:ilvl="6" w:tplc="0409000F" w:tentative="1">
+      <w:start w:val="1"/>
+      <w:numFmt w:val="decimal"/>
+      <w:lvlText w:val="%7."/>
+      <w:lvlJc w:val="left"/>
+      <w:pPr>
+        <w:ind w:left="5040" w:hanging="360"/>
+      </w:pPr>
+    </w:lvl>
+    <w:lvl w:ilvl="7" w:tplc="04090019" w:tentative="1">
+      <w:start w:val="1"/>
+      <w:numFmt w:val="lowerLetter"/>
+      <w:lvlText w:val="%8."/>
+      <w:lvlJc w:val="left"/>
+      <w:pPr>
+        <w:ind w:left="5760" w:hanging="360"/>
+      </w:pPr>
+    </w:lvl>
+    <w:lvl w:ilvl="8" w:tplc="0409001B" w:tentative="1">
+      <w:start w:val="1"/>
+      <w:numFmt w:val="lowerRoman"/>
+      <w:lvlText w:val="%9."/>
+      <w:lvlJc w:val="right"/>
+      <w:pPr>
+        <w:ind w:left="6480" w:hanging="180"/>
+      </w:pPr>
+    </w:lvl>
+  </w:abstractNum>
+  <w:abstractNum w:abstractNumId="16" w15:restartNumberingAfterBreak="0">
     <w:nsid w:val="66367E7E"/>
     <w:multiLevelType w:val="multilevel"/>
     <w:tmpl w:val="9C6AFD62"/>
@@ -4808,7 +3571,7 @@
       </w:pPr>
     </w:lvl>
   </w:abstractNum>
-  <w:abstractNum w:abstractNumId="14" w15:restartNumberingAfterBreak="0">
+  <w:abstractNum w:abstractNumId="17" w15:restartNumberingAfterBreak="0">
     <w:nsid w:val="693D0F9C"/>
     <w:multiLevelType w:val="multilevel"/>
     <w:tmpl w:val="25BAA792"/>
@@ -4921,7 +3684,7 @@
       </w:pPr>
     </w:lvl>
   </w:abstractNum>
-  <w:abstractNum w:abstractNumId="15" w15:restartNumberingAfterBreak="0">
+  <w:abstractNum w:abstractNumId="18" w15:restartNumberingAfterBreak="0">
     <w:nsid w:val="77A67E4B"/>
     <w:multiLevelType w:val="hybridMultilevel"/>
     <w:tmpl w:val="7E388D94"/>
@@ -5034,23 +3797,109 @@
       </w:rPr>
     </w:lvl>
   </w:abstractNum>
+  <w:abstractNum w:abstractNumId="19" w15:restartNumberingAfterBreak="0">
+    <w:nsid w:val="7A15591C"/>
+    <w:multiLevelType w:val="hybridMultilevel"/>
+    <w:tmpl w:val="304C57F4"/>
+    <w:lvl w:ilvl="0" w:tplc="0409000F">
+      <w:start w:val="1"/>
+      <w:numFmt w:val="decimal"/>
+      <w:lvlText w:val="%1."/>
+      <w:lvlJc w:val="left"/>
+      <w:pPr>
+        <w:ind w:left="720" w:hanging="360"/>
+      </w:pPr>
+    </w:lvl>
+    <w:lvl w:ilvl="1" w:tplc="04090019" w:tentative="1">
+      <w:start w:val="1"/>
+      <w:numFmt w:val="lowerLetter"/>
+      <w:lvlText w:val="%2."/>
+      <w:lvlJc w:val="left"/>
+      <w:pPr>
+        <w:ind w:left="1440" w:hanging="360"/>
+      </w:pPr>
+    </w:lvl>
+    <w:lvl w:ilvl="2" w:tplc="0409001B" w:tentative="1">
+      <w:start w:val="1"/>
+      <w:numFmt w:val="lowerRoman"/>
+      <w:lvlText w:val="%3."/>
+      <w:lvlJc w:val="right"/>
+      <w:pPr>
+        <w:ind w:left="2160" w:hanging="180"/>
+      </w:pPr>
+    </w:lvl>
+    <w:lvl w:ilvl="3" w:tplc="0409000F" w:tentative="1">
+      <w:start w:val="1"/>
+      <w:numFmt w:val="decimal"/>
+      <w:lvlText w:val="%4."/>
+      <w:lvlJc w:val="left"/>
+      <w:pPr>
+        <w:ind w:left="2880" w:hanging="360"/>
+      </w:pPr>
+    </w:lvl>
+    <w:lvl w:ilvl="4" w:tplc="04090019" w:tentative="1">
+      <w:start w:val="1"/>
+      <w:numFmt w:val="lowerLetter"/>
+      <w:lvlText w:val="%5."/>
+      <w:lvlJc w:val="left"/>
+      <w:pPr>
+        <w:ind w:left="3600" w:hanging="360"/>
+      </w:pPr>
+    </w:lvl>
+    <w:lvl w:ilvl="5" w:tplc="0409001B" w:tentative="1">
+      <w:start w:val="1"/>
+      <w:numFmt w:val="lowerRoman"/>
+      <w:lvlText w:val="%6."/>
+      <w:lvlJc w:val="right"/>
+      <w:pPr>
+        <w:ind w:left="4320" w:hanging="180"/>
+      </w:pPr>
+    </w:lvl>
+    <w:lvl w:ilvl="6" w:tplc="0409000F" w:tentative="1">
+      <w:start w:val="1"/>
+      <w:numFmt w:val="decimal"/>
+      <w:lvlText w:val="%7."/>
+      <w:lvlJc w:val="left"/>
+      <w:pPr>
+        <w:ind w:left="5040" w:hanging="360"/>
+      </w:pPr>
+    </w:lvl>
+    <w:lvl w:ilvl="7" w:tplc="04090019" w:tentative="1">
+      <w:start w:val="1"/>
+      <w:numFmt w:val="lowerLetter"/>
+      <w:lvlText w:val="%8."/>
+      <w:lvlJc w:val="left"/>
+      <w:pPr>
+        <w:ind w:left="5760" w:hanging="360"/>
+      </w:pPr>
+    </w:lvl>
+    <w:lvl w:ilvl="8" w:tplc="0409001B" w:tentative="1">
+      <w:start w:val="1"/>
+      <w:numFmt w:val="lowerRoman"/>
+      <w:lvlText w:val="%9."/>
+      <w:lvlJc w:val="right"/>
+      <w:pPr>
+        <w:ind w:left="6480" w:hanging="180"/>
+      </w:pPr>
+    </w:lvl>
+  </w:abstractNum>
   <w:num w:numId="1" w16cid:durableId="1136989600">
-    <w:abstractNumId w:val="9"/>
+    <w:abstractNumId w:val="11"/>
   </w:num>
   <w:num w:numId="2" w16cid:durableId="1616061303">
     <w:abstractNumId w:val="0"/>
   </w:num>
   <w:num w:numId="3" w16cid:durableId="1627807220">
-    <w:abstractNumId w:val="8"/>
+    <w:abstractNumId w:val="10"/>
   </w:num>
   <w:num w:numId="4" w16cid:durableId="419834905">
-    <w:abstractNumId w:val="4"/>
+    <w:abstractNumId w:val="5"/>
   </w:num>
   <w:num w:numId="5" w16cid:durableId="21060599">
-    <w:abstractNumId w:val="14"/>
+    <w:abstractNumId w:val="17"/>
   </w:num>
   <w:num w:numId="6" w16cid:durableId="1349259351">
-    <w:abstractNumId w:val="10"/>
+    <w:abstractNumId w:val="12"/>
   </w:num>
   <w:num w:numId="7" w16cid:durableId="433717904">
     <w:abstractNumId w:val="2"/>
@@ -5059,27 +3908,39 @@
     <w:abstractNumId w:val="1"/>
   </w:num>
   <w:num w:numId="9" w16cid:durableId="1833373029">
-    <w:abstractNumId w:val="7"/>
+    <w:abstractNumId w:val="9"/>
   </w:num>
   <w:num w:numId="10" w16cid:durableId="648939642">
-    <w:abstractNumId w:val="5"/>
+    <w:abstractNumId w:val="6"/>
   </w:num>
   <w:num w:numId="11" w16cid:durableId="1952935650">
-    <w:abstractNumId w:val="13"/>
+    <w:abstractNumId w:val="16"/>
   </w:num>
   <w:num w:numId="12" w16cid:durableId="490754515">
-    <w:abstractNumId w:val="6"/>
+    <w:abstractNumId w:val="8"/>
   </w:num>
   <w:num w:numId="13" w16cid:durableId="1041710938">
-    <w:abstractNumId w:val="12"/>
+    <w:abstractNumId w:val="14"/>
   </w:num>
   <w:num w:numId="14" w16cid:durableId="2050568768">
-    <w:abstractNumId w:val="11"/>
+    <w:abstractNumId w:val="13"/>
   </w:num>
   <w:num w:numId="15" w16cid:durableId="1117606936">
     <w:abstractNumId w:val="3"/>
   </w:num>
   <w:num w:numId="16" w16cid:durableId="101069171">
+    <w:abstractNumId w:val="18"/>
+  </w:num>
+  <w:num w:numId="17" w16cid:durableId="1509176953">
+    <w:abstractNumId w:val="19"/>
+  </w:num>
+  <w:num w:numId="18" w16cid:durableId="600839312">
+    <w:abstractNumId w:val="4"/>
+  </w:num>
+  <w:num w:numId="19" w16cid:durableId="1311712502">
+    <w:abstractNumId w:val="7"/>
+  </w:num>
+  <w:num w:numId="20" w16cid:durableId="476650710">
     <w:abstractNumId w:val="15"/>
   </w:num>
   <w:numIdMacAtCleanup w:val="8"/>

</xml_diff>